<commit_message>
Open CV as PDF and add personal homepage link
</commit_message>
<xml_diff>
--- a/files/Zhuoqing_Zhong_CV.docx
+++ b/files/Zhuoqing_Zhong_CV.docx
@@ -78,6 +78,26 @@
             <w:lang w:eastAsia="zh-CN"/>
           </w:rPr>
           <w:t xml:space="preserve">LinkedIn</w:t>
+        </w:r>
+      </w:hyperlink>
+      <w:r>
+        <w:rPr>
+          <w:rFonts w:ascii="Times New Roman" w:hAnsi="Times New Roman" w:hint="eastAsia"/>
+          <w:sz w:val="20"/>
+          <w:szCs w:val="20"/>
+          <w:lang w:eastAsia="zh-CN"/>
+        </w:rPr>
+        <w:t xml:space="preserve"> | </w:t>
+      </w:r>
+      <w:hyperlink r:id="rIdHomepage">
+        <w:r>
+          <w:rPr>
+            <w:rFonts w:ascii="Times New Roman" w:hAnsi="Times New Roman" w:hint="eastAsia"/>
+            <w:sz w:val="20"/>
+            <w:szCs w:val="20"/>
+            <w:lang w:eastAsia="zh-CN"/>
+          </w:rPr>
+          <w:t xml:space="preserve">zhuoqinz.github.io</w:t>
         </w:r>
       </w:hyperlink>
     </w:p>

</xml_diff>

<commit_message>
Simplify CV homepage label and honors
</commit_message>
<xml_diff>
--- a/files/Zhuoqing_Zhong_CV.docx
+++ b/files/Zhuoqing_Zhong_CV.docx
@@ -97,7 +97,7 @@
             <w:szCs w:val="20"/>
             <w:lang w:eastAsia="zh-CN"/>
           </w:rPr>
-          <w:t xml:space="preserve">zhuoqinz.github.io</w:t>
+          <w:t xml:space="preserve">Webpage</w:t>
         </w:r>
       </w:hyperlink>
     </w:p>
@@ -272,7 +272,7 @@
           <w:szCs w:val="21"/>
           <w:lang w:eastAsia="zh-CN"/>
         </w:rPr>
-        <w:t xml:space="preserve">Honors (2024-2025): Zhejiang Province Government Scholarship; Dean's First-class Scholarship; Dean's Scholarship for Research and Innovation.</w:t>
+        <w:t xml:space="preserve">Honors: Zhejiang Province Government Scholarship; Dean's First-class Scholarship; Dean's Scholarship for Research and Innovation.</w:t>
       </w:r>
     </w:p>
     <w:p>

</xml_diff>

<commit_message>
Adopt refined general research CV
</commit_message>
<xml_diff>
--- a/files/Zhuoqing_Zhong_CV.docx
+++ b/files/Zhuoqing_Zhong_CV.docx
@@ -109,7 +109,7 @@
         </w:pBdr>
         <w:autoSpaceDE/>
         <w:autoSpaceDN/>
-        <w:spacing w:after="40"/>
+        <w:spacing w:after="50" w:before="60"/>
         <w:outlineLvl w:val="0"/>
         <w:rPr>
           <w:rFonts w:ascii="Times New Roman Regular" w:hAnsi="Times New Roman Regular" w:cs="Times New Roman Regular"/>
@@ -134,7 +134,7 @@
         <w:widowControl/>
         <w:autoSpaceDE/>
         <w:autoSpaceDN/>
-        <w:spacing w:after="10" w:line="192" w:lineRule="auto"/>
+        <w:spacing w:after="10" w:line="212" w:lineRule="auto"/>
         <w:rPr>
           <w:rFonts w:ascii="Times New Roman Regular" w:hAnsi="Times New Roman Regular" w:cs="Times New Roman Regular"/>
           <w:sz w:val="21"/>
@@ -176,6 +176,7 @@
           <w:szCs w:val="21"/>
           <w:lang w:eastAsia="zh-CN"/>
         </w:rPr>
+        <w:spacing/>
       </w:pPr>
       <w:r>
         <w:rPr>
@@ -199,6 +200,7 @@
         <w:tabs>
           <w:tab w:val="right" w:pos="10880"/>
         </w:tabs>
+        <w:spacing/>
       </w:pPr>
       <w:r>
         <w:rPr>
@@ -230,7 +232,7 @@
         </w:numPr>
         <w:autoSpaceDE/>
         <w:autoSpaceDN/>
-        <w:spacing w:after="10" w:line="192" w:lineRule="auto"/>
+        <w:spacing w:after="20" w:line="212" w:lineRule="auto"/>
         <w:ind w:hanging="357"/>
         <w:rPr>
           <w:rFonts w:ascii="Times New Roman Regular" w:hAnsi="Times New Roman Regular" w:cs="Times New Roman Regular"/>
@@ -257,7 +259,7 @@
         </w:numPr>
         <w:autoSpaceDE/>
         <w:autoSpaceDN/>
-        <w:spacing w:after="10" w:line="192" w:lineRule="auto"/>
+        <w:spacing w:after="20" w:line="212" w:lineRule="auto"/>
         <w:ind w:hanging="357"/>
         <w:rPr>
           <w:rFonts w:ascii="Times New Roman Regular" w:hAnsi="Times New Roman Regular" w:cs="Times New Roman Regular"/>
@@ -283,7 +285,7 @@
         </w:pBdr>
         <w:autoSpaceDE/>
         <w:autoSpaceDN/>
-        <w:spacing w:after="40"/>
+        <w:spacing w:after="50" w:before="60"/>
         <w:outlineLvl w:val="0"/>
         <w:rPr>
           <w:rFonts w:ascii="Times New Roman Regular" w:hAnsi="Times New Roman Regular" w:cs="Times New Roman Regular"/>
@@ -313,7 +315,7 @@
         </w:numPr>
         <w:autoSpaceDE/>
         <w:autoSpaceDN/>
-        <w:spacing w:after="10" w:line="192" w:lineRule="auto"/>
+        <w:spacing w:after="20" w:line="212" w:lineRule="auto"/>
         <w:ind w:hanging="357"/>
         <w:rPr>
           <w:rFonts w:ascii="Times New Roman Regular" w:hAnsi="Times New Roman Regular" w:cs="Times New Roman Regular"/>
@@ -379,7 +381,7 @@
           <w:szCs w:val="21"/>
           <w:lang w:eastAsia="zh-CN"/>
         </w:rPr>
-        <w:t xml:space="preserve">", CVPR Workshop on Computer Vision for Children (CV4CHL), 2026, pp. 5619-5630.</w:t>
+        <w:t xml:space="preserve">", CVPR Workshops (CV4CHL), 2026, pp. 5619-5630.</w:t>
       </w:r>
     </w:p>
     <w:p>
@@ -391,7 +393,7 @@
         </w:numPr>
         <w:autoSpaceDE/>
         <w:autoSpaceDN/>
-        <w:spacing w:after="10" w:line="192" w:lineRule="auto"/>
+        <w:spacing w:after="20" w:line="212" w:lineRule="auto"/>
         <w:ind w:hanging="357"/>
         <w:rPr>
           <w:rFonts w:ascii="Times New Roman Regular" w:hAnsi="Times New Roman Regular" w:cs="Times New Roman Regular"/>
@@ -428,7 +430,7 @@
           <w:lang w:eastAsia="zh-CN"/>
           <w:b w:val="0"/>
         </w:rPr>
-        <w:t xml:space="preserve">*, Hengyu Zhang, Xubin Sun, Baha Ihnaini.</w:t>
+        <w:t xml:space="preserve">*, et al.</w:t>
       </w:r>
       <w:r>
         <w:rPr>
@@ -469,7 +471,7 @@
         </w:numPr>
         <w:autoSpaceDE/>
         <w:autoSpaceDN/>
-        <w:spacing w:after="10" w:line="192" w:lineRule="auto"/>
+        <w:spacing w:after="20" w:line="212" w:lineRule="auto"/>
         <w:ind w:hanging="357"/>
         <w:rPr>
           <w:rFonts w:ascii="Times New Roman Regular" w:hAnsi="Times New Roman Regular" w:cs="Times New Roman Regular"/>
@@ -547,7 +549,7 @@
         </w:numPr>
         <w:autoSpaceDE/>
         <w:autoSpaceDN/>
-        <w:spacing w:after="10" w:line="192" w:lineRule="auto"/>
+        <w:spacing w:after="20" w:line="212" w:lineRule="auto"/>
         <w:ind w:hanging="357"/>
         <w:rPr>
           <w:rFonts w:ascii="Times New Roman Regular" w:hAnsi="Times New Roman Regular" w:cs="Times New Roman Regular"/>
@@ -584,7 +586,7 @@
           <w:lang w:eastAsia="zh-CN"/>
           <w:b w:val="0"/>
         </w:rPr>
-        <w:t xml:space="preserve"> (co-first author), Zihui Deng, Jiayi Xu, Ruoling Zhao.</w:t>
+        <w:t xml:space="preserve"> (co-first author), et al.</w:t>
       </w:r>
       <w:r>
         <w:rPr>
@@ -623,6 +625,7 @@
           <w:szCs w:val="21"/>
           <w:lang w:eastAsia="zh-CN"/>
         </w:rPr>
+        <w:spacing/>
       </w:pPr>
       <w:r>
         <w:rPr>
@@ -641,7 +644,7 @@
         </w:pBdr>
         <w:autoSpaceDE/>
         <w:autoSpaceDN/>
-        <w:spacing w:after="40"/>
+        <w:spacing w:after="50" w:before="60"/>
         <w:outlineLvl w:val="0"/>
         <w:rPr>
           <w:rFonts w:ascii="Times New Roman Regular" w:hAnsi="Times New Roman Regular" w:cs="Times New Roman Regular"/>
@@ -674,6 +677,7 @@
           <w:szCs w:val="21"/>
           <w:lang w:eastAsia="zh-CN"/>
         </w:rPr>
+        <w:spacing/>
       </w:pPr>
       <w:r>
         <w:rPr>
@@ -692,7 +696,7 @@
         <w:widowControl/>
         <w:autoSpaceDE/>
         <w:autoSpaceDN/>
-        <w:spacing w:after="10" w:line="192" w:lineRule="auto"/>
+        <w:spacing w:after="10" w:line="212" w:lineRule="auto"/>
         <w:rPr>
           <w:rFonts w:ascii="Times New Roman Regular" w:hAnsi="Times New Roman Regular" w:cs="Times New Roman Regular"/>
           <w:sz w:val="21"/>
@@ -711,7 +715,7 @@
           <w:lang w:eastAsia="zh-CN"/>
           <w:b w:val="0"/>
         </w:rPr>
-        <w:t xml:space="preserve">Research Intern, Artificial Intelligence Algorithm Integrated Innovation Center</w:t>
+        <w:t xml:space="preserve">Research Intern</w:t>
       </w:r>
       <w:r>
         <w:rPr>
@@ -735,7 +739,7 @@
         </w:numPr>
         <w:autoSpaceDE/>
         <w:autoSpaceDN/>
-        <w:spacing w:after="10" w:line="192" w:lineRule="auto"/>
+        <w:spacing w:after="20" w:line="212" w:lineRule="auto"/>
         <w:ind w:hanging="357"/>
         <w:rPr>
           <w:rFonts w:ascii="Times New Roman Regular" w:hAnsi="Times New Roman Regular" w:cs="Times New Roman Regular"/>
@@ -751,7 +755,7 @@
           <w:szCs w:val="21"/>
           <w:lang w:eastAsia="zh-CN"/>
         </w:rPr>
-        <w:t xml:space="preserve">Implemented a data pipeline and token-level attribution visualizations using Layer-wise Relevance Propagation (LRP) and DeepLIFT for language model interpretability.</w:t>
+        <w:t>Implemented a data pipeline and token-level explanations for language models using Layer-wise Relevance Propagation (LRP) and DeepLIFT.</w:t>
       </w:r>
     </w:p>
     <w:p>
@@ -763,7 +767,7 @@
         </w:numPr>
         <w:autoSpaceDE/>
         <w:autoSpaceDN/>
-        <w:spacing w:after="10" w:line="192" w:lineRule="auto"/>
+        <w:spacing w:after="20" w:line="212" w:lineRule="auto"/>
         <w:ind w:hanging="357"/>
         <w:rPr>
           <w:rFonts w:ascii="Times New Roman Regular" w:hAnsi="Times New Roman Regular" w:cs="Times New Roman Regular"/>
@@ -779,7 +783,7 @@
           <w:szCs w:val="21"/>
           <w:lang w:eastAsia="zh-CN"/>
         </w:rPr>
-        <w:t xml:space="preserve">Compared attribution methods on text examples, including medical text, and visualized token relevance to examine model behavior.</w:t>
+        <w:t>Compared attribution methods on general and medical text examples through token-relevance visualizations.</w:t>
       </w:r>
     </w:p>
     <w:p>
@@ -790,7 +794,7 @@
         </w:pBdr>
         <w:autoSpaceDE/>
         <w:autoSpaceDN/>
-        <w:spacing w:after="40"/>
+        <w:spacing w:after="50" w:before="60"/>
         <w:outlineLvl w:val="0"/>
         <w:rPr>
           <w:rFonts w:ascii="Times New Roman Regular" w:hAnsi="Times New Roman Regular" w:cs="Times New Roman Regular"/>
@@ -817,7 +821,7 @@
         <w:widowControl/>
         <w:autoSpaceDE/>
         <w:autoSpaceDN/>
-        <w:spacing w:after="10" w:line="192" w:lineRule="auto"/>
+        <w:spacing w:after="20" w:line="212" w:lineRule="auto" w:before="20"/>
         <w:rPr>
           <w:rFonts w:ascii="Times New Roman Bold" w:hAnsi="Times New Roman Bold" w:cs="Times New Roman Bold"/>
           <w:b/>
@@ -826,44 +830,21 @@
           <w:szCs w:val="21"/>
           <w:lang w:eastAsia="zh-CN"/>
         </w:rPr>
-      </w:pPr>
-      <w:r>
-        <w:rPr>
-          <w:rFonts w:ascii="Times New Roman Bold" w:hAnsi="Times New Roman Bold" w:cs="Times New Roman Bold"/>
-          <w:bCs/>
-          <w:sz w:val="21"/>
-          <w:szCs w:val="21"/>
-          <w:lang w:eastAsia="zh-CN"/>
-          <w:b w:val="1"/>
-        </w:rPr>
-        <w:t xml:space="preserve">RepoFusion-in-Decoder</w:t>
-      </w:r>
-    </w:p>
-    <w:p>
-      <w:pPr>
-        <w:widowControl/>
-        <w:autoSpaceDE/>
-        <w:autoSpaceDN/>
-        <w:spacing w:after="10" w:line="192" w:lineRule="auto"/>
-        <w:rPr>
-          <w:rFonts w:ascii="Times New Roman Regular" w:hAnsi="Times New Roman Regular" w:cs="Times New Roman Regular"/>
-          <w:sz w:val="21"/>
-          <w:szCs w:val="21"/>
-          <w:lang w:eastAsia="zh-CN"/>
-        </w:rPr>
         <w:tabs>
           <w:tab w:val="right" w:pos="10880"/>
         </w:tabs>
-      </w:pPr>
-      <w:r>
-        <w:rPr>
-          <w:rFonts w:ascii="Times New Roman Regular" w:hAnsi="Times New Roman Regular" w:cs="Times New Roman Regular" w:hint="eastAsia"/>
-          <w:sz w:val="21"/>
-          <w:szCs w:val="21"/>
-          <w:lang w:eastAsia="zh-CN"/>
-          <w:b w:val="0"/>
-        </w:rPr>
-        <w:t xml:space="preserve">Efficient cross-file code completion via lightweight encoder fusion</w:t>
+        <w:keepNext/>
+      </w:pPr>
+      <w:r>
+        <w:rPr>
+          <w:rFonts w:ascii="Times New Roman Bold" w:hAnsi="Times New Roman Bold" w:cs="Times New Roman Bold"/>
+          <w:bCs/>
+          <w:sz w:val="21"/>
+          <w:szCs w:val="21"/>
+          <w:lang w:eastAsia="zh-CN"/>
+          <w:b w:val="1"/>
+        </w:rPr>
+        <w:t>Developmental Learning for Multimodal Models</w:t>
       </w:r>
       <w:r>
         <w:rPr>
@@ -875,7 +856,7 @@
         </w:rPr>
         <w:t xml:space="preserve"/>
         <w:tab/>
-        <w:t xml:space="preserve">Apr 2025 - Aug 2025</w:t>
+        <w:t xml:space="preserve">Nov 2025 - Mar 2026</w:t>
       </w:r>
     </w:p>
     <w:p>
@@ -887,7 +868,7 @@
         </w:numPr>
         <w:autoSpaceDE/>
         <w:autoSpaceDN/>
-        <w:spacing w:after="10" w:line="192" w:lineRule="auto"/>
+        <w:spacing w:after="20" w:line="212" w:lineRule="auto"/>
         <w:ind w:hanging="357"/>
         <w:rPr>
           <w:rFonts w:ascii="Times New Roman Regular" w:hAnsi="Times New Roman Regular" w:cs="Times New Roman Regular"/>
@@ -903,7 +884,7 @@
           <w:szCs w:val="21"/>
           <w:lang w:eastAsia="zh-CN"/>
         </w:rPr>
-        <w:t xml:space="preserve">Implemented a lightweight encoder and cross-attention modules to integrate retrieved repository context into a frozen decoder-only code language model.</w:t>
+        <w:t xml:space="preserve">Surveyed developmental learning for multimodal models, focusing on grounding, supervision inference, memory, and continual adaptation.</w:t>
       </w:r>
     </w:p>
     <w:p>
@@ -915,7 +896,7 @@
         </w:numPr>
         <w:autoSpaceDE/>
         <w:autoSpaceDN/>
-        <w:spacing w:after="10" w:line="192" w:lineRule="auto"/>
+        <w:spacing w:after="20" w:line="212" w:lineRule="auto"/>
         <w:ind w:hanging="357"/>
         <w:rPr>
           <w:rFonts w:ascii="Times New Roman Regular" w:hAnsi="Times New Roman Regular" w:cs="Times New Roman Regular"/>
@@ -931,7 +912,77 @@
           <w:szCs w:val="21"/>
           <w:lang w:eastAsia="zh-CN"/>
         </w:rPr>
-        <w:t xml:space="preserve">Built a BM25 retrieval and sliding-window chunking pipeline, with cached encoder states to reuse cross-file context.</w:t>
+        <w:t xml:space="preserve">Contributed to a framework spanning task formation, supervision inference, and continuous growth; analyzed limitations in sequential multimodal data and evaluation benchmarks.</w:t>
+      </w:r>
+    </w:p>
+    <w:p>
+      <w:pPr>
+        <w:widowControl/>
+        <w:autoSpaceDE/>
+        <w:autoSpaceDN/>
+        <w:spacing w:after="20" w:line="212" w:lineRule="auto" w:before="60"/>
+        <w:rPr>
+          <w:rFonts w:ascii="Times New Roman Bold" w:hAnsi="Times New Roman Bold" w:cs="Times New Roman Bold"/>
+          <w:b/>
+          <w:bCs/>
+          <w:sz w:val="21"/>
+          <w:szCs w:val="21"/>
+          <w:lang w:eastAsia="zh-CN"/>
+        </w:rPr>
+        <w:tabs>
+          <w:tab w:val="right" w:pos="10880"/>
+        </w:tabs>
+        <w:keepNext/>
+      </w:pPr>
+      <w:r>
+        <w:rPr>
+          <w:rFonts w:ascii="Times New Roman Bold" w:hAnsi="Times New Roman Bold" w:cs="Times New Roman Bold"/>
+          <w:bCs/>
+          <w:sz w:val="21"/>
+          <w:szCs w:val="21"/>
+          <w:lang w:eastAsia="zh-CN"/>
+          <w:b w:val="1"/>
+        </w:rPr>
+        <w:t>LLM Reliability and Rejection Behavior</w:t>
+      </w:r>
+      <w:r>
+        <w:rPr>
+          <w:rFonts w:ascii="Times New Roman Regular" w:hAnsi="Times New Roman Regular" w:cs="Times New Roman Regular" w:hint="eastAsia"/>
+          <w:sz w:val="21"/>
+          <w:szCs w:val="21"/>
+          <w:lang w:eastAsia="zh-CN"/>
+          <w:b w:val="0"/>
+        </w:rPr>
+        <w:t xml:space="preserve"/>
+        <w:tab/>
+        <w:t xml:space="preserve">Nov 2024 - May 2025</w:t>
+      </w:r>
+    </w:p>
+    <w:p>
+      <w:pPr>
+        <w:widowControl/>
+        <w:autoSpaceDE/>
+        <w:autoSpaceDN/>
+        <w:spacing w:after="10" w:line="212" w:lineRule="auto"/>
+        <w:rPr>
+          <w:rFonts w:ascii="Times New Roman Regular" w:hAnsi="Times New Roman Regular" w:cs="Times New Roman Regular"/>
+          <w:sz w:val="21"/>
+          <w:szCs w:val="21"/>
+          <w:lang w:eastAsia="zh-CN"/>
+        </w:rPr>
+        <w:tabs>
+          <w:tab w:val="right" w:pos="10880"/>
+        </w:tabs>
+      </w:pPr>
+      <w:r>
+        <w:rPr>
+          <w:rFonts w:ascii="Times New Roman Regular" w:hAnsi="Times New Roman Regular" w:cs="Times New Roman Regular" w:hint="eastAsia"/>
+          <w:sz w:val="21"/>
+          <w:szCs w:val="21"/>
+          <w:lang w:eastAsia="zh-CN"/>
+          <w:b w:val="0"/>
+        </w:rPr>
+        <w:t xml:space="preserve">Co-first author | Advisor: Dr. Baha Ihnaini</w:t>
       </w:r>
     </w:p>
     <w:p>
@@ -943,7 +994,7 @@
         </w:numPr>
         <w:autoSpaceDE/>
         <w:autoSpaceDN/>
-        <w:spacing w:after="10" w:line="192" w:lineRule="auto"/>
+        <w:spacing w:after="20" w:line="212" w:lineRule="auto"/>
         <w:ind w:hanging="357"/>
         <w:rPr>
           <w:rFonts w:ascii="Times New Roman Regular" w:hAnsi="Times New Roman Regular" w:cs="Times New Roman Regular"/>
@@ -959,73 +1010,7 @@
           <w:szCs w:val="21"/>
           <w:lang w:eastAsia="zh-CN"/>
         </w:rPr>
-        <w:t xml:space="preserve">Evaluated completion quality and prefill latency on Long Code Arena and RepoEval-Updated; conducted ablations on cross-attention depth to study the efficiency-quality trade-off.</w:t>
-      </w:r>
-    </w:p>
-    <w:p>
-      <w:pPr>
-        <w:widowControl/>
-        <w:autoSpaceDE/>
-        <w:autoSpaceDN/>
-        <w:spacing w:after="10" w:line="192" w:lineRule="auto"/>
-        <w:rPr>
-          <w:rFonts w:ascii="Times New Roman Bold" w:hAnsi="Times New Roman Bold" w:cs="Times New Roman Bold"/>
-          <w:b/>
-          <w:bCs/>
-          <w:sz w:val="21"/>
-          <w:szCs w:val="21"/>
-          <w:lang w:eastAsia="zh-CN"/>
-        </w:rPr>
-      </w:pPr>
-      <w:r>
-        <w:rPr>
-          <w:rFonts w:ascii="Times New Roman Bold" w:hAnsi="Times New Roman Bold" w:cs="Times New Roman Bold"/>
-          <w:bCs/>
-          <w:sz w:val="21"/>
-          <w:szCs w:val="21"/>
-          <w:lang w:eastAsia="zh-CN"/>
-          <w:b w:val="1"/>
-        </w:rPr>
-        <w:t xml:space="preserve">Large Language Models for Mild Cognitive Impairment Screening</w:t>
-      </w:r>
-    </w:p>
-    <w:p>
-      <w:pPr>
-        <w:widowControl/>
-        <w:autoSpaceDE/>
-        <w:autoSpaceDN/>
-        <w:spacing w:after="10" w:line="192" w:lineRule="auto"/>
-        <w:rPr>
-          <w:rFonts w:ascii="Times New Roman Regular" w:hAnsi="Times New Roman Regular" w:cs="Times New Roman Regular"/>
-          <w:sz w:val="21"/>
-          <w:szCs w:val="21"/>
-          <w:lang w:eastAsia="zh-CN"/>
-        </w:rPr>
-        <w:tabs>
-          <w:tab w:val="right" w:pos="10880"/>
-        </w:tabs>
-      </w:pPr>
-      <w:r>
-        <w:rPr>
-          <w:rFonts w:ascii="Times New Roman Regular" w:hAnsi="Times New Roman Regular" w:cs="Times New Roman Regular" w:hint="eastAsia"/>
-          <w:sz w:val="21"/>
-          <w:szCs w:val="21"/>
-          <w:lang w:eastAsia="zh-CN"/>
-          <w:b w:val="0"/>
-        </w:rPr>
-        <w:t xml:space="preserve">Co-first author | Advisor: Dr. Baha Ihnaini</w:t>
-      </w:r>
-      <w:r>
-        <w:rPr>
-          <w:rFonts w:ascii="Times New Roman Regular" w:hAnsi="Times New Roman Regular" w:cs="Times New Roman Regular" w:hint="eastAsia"/>
-          <w:sz w:val="21"/>
-          <w:szCs w:val="21"/>
-          <w:lang w:eastAsia="zh-CN"/>
-          <w:b w:val="0"/>
-        </w:rPr>
-        <w:t xml:space="preserve"/>
-        <w:tab/>
-        <w:t xml:space="preserve">Feb 2024 - Jul 2025</w:t>
+        <w:t xml:space="preserve">Conducted a literature review across five scholarly databases, applying inclusion criteria, citation tracing, and structured extraction of models, datasets, and metrics.</w:t>
       </w:r>
     </w:p>
     <w:p>
@@ -1037,7 +1022,7 @@
         </w:numPr>
         <w:autoSpaceDE/>
         <w:autoSpaceDN/>
-        <w:spacing w:after="10" w:line="192" w:lineRule="auto"/>
+        <w:spacing w:after="20" w:line="212" w:lineRule="auto"/>
         <w:ind w:hanging="357"/>
         <w:rPr>
           <w:rFonts w:ascii="Times New Roman Regular" w:hAnsi="Times New Roman Regular" w:cs="Times New Roman Regular"/>
@@ -1053,7 +1038,77 @@
           <w:szCs w:val="21"/>
           <w:lang w:eastAsia="zh-CN"/>
         </w:rPr>
-        <w:t xml:space="preserve">Built a speech-to-text screening pipeline with audio normalization and transcript correction; curated a Chinese-language data subset and implemented balanced 5-fold cross-validation.</w:t>
+        <w:t xml:space="preserve">Compared fine-tuning, RAG, and RAFT for rejection behavior, hallucination mitigation, computational cost, and domain adaptability; co-developed a four-dimensional review framework.</w:t>
+      </w:r>
+    </w:p>
+    <w:p>
+      <w:pPr>
+        <w:widowControl/>
+        <w:autoSpaceDE/>
+        <w:autoSpaceDN/>
+        <w:spacing w:after="20" w:line="212" w:lineRule="auto" w:before="60"/>
+        <w:rPr>
+          <w:rFonts w:ascii="Times New Roman Bold" w:hAnsi="Times New Roman Bold" w:cs="Times New Roman Bold"/>
+          <w:b/>
+          <w:bCs/>
+          <w:sz w:val="21"/>
+          <w:szCs w:val="21"/>
+          <w:lang w:eastAsia="zh-CN"/>
+        </w:rPr>
+        <w:tabs>
+          <w:tab w:val="right" w:pos="10880"/>
+        </w:tabs>
+        <w:keepNext/>
+      </w:pPr>
+      <w:r>
+        <w:rPr>
+          <w:rFonts w:ascii="Times New Roman Bold" w:hAnsi="Times New Roman Bold" w:cs="Times New Roman Bold"/>
+          <w:bCs/>
+          <w:sz w:val="21"/>
+          <w:szCs w:val="21"/>
+          <w:lang w:eastAsia="zh-CN"/>
+          <w:b w:val="1"/>
+        </w:rPr>
+        <w:t>Language Models for Cognitive Screening</w:t>
+      </w:r>
+      <w:r>
+        <w:rPr>
+          <w:rFonts w:ascii="Times New Roman Regular" w:hAnsi="Times New Roman Regular" w:cs="Times New Roman Regular" w:hint="eastAsia"/>
+          <w:sz w:val="21"/>
+          <w:szCs w:val="21"/>
+          <w:lang w:eastAsia="zh-CN"/>
+          <w:b w:val="0"/>
+        </w:rPr>
+        <w:t xml:space="preserve"/>
+        <w:tab/>
+        <w:t xml:space="preserve">Feb 2024 - Jul 2025</w:t>
+      </w:r>
+    </w:p>
+    <w:p>
+      <w:pPr>
+        <w:widowControl/>
+        <w:autoSpaceDE/>
+        <w:autoSpaceDN/>
+        <w:spacing w:after="10" w:line="212" w:lineRule="auto"/>
+        <w:rPr>
+          <w:rFonts w:ascii="Times New Roman Regular" w:hAnsi="Times New Roman Regular" w:cs="Times New Roman Regular"/>
+          <w:sz w:val="21"/>
+          <w:szCs w:val="21"/>
+          <w:lang w:eastAsia="zh-CN"/>
+        </w:rPr>
+        <w:tabs>
+          <w:tab w:val="right" w:pos="10880"/>
+        </w:tabs>
+      </w:pPr>
+      <w:r>
+        <w:rPr>
+          <w:rFonts w:ascii="Times New Roman Regular" w:hAnsi="Times New Roman Regular" w:cs="Times New Roman Regular" w:hint="eastAsia"/>
+          <w:sz w:val="21"/>
+          <w:szCs w:val="21"/>
+          <w:lang w:eastAsia="zh-CN"/>
+          <w:b w:val="0"/>
+        </w:rPr>
+        <w:t xml:space="preserve">Co-first author | Advisor: Dr. Baha Ihnaini</w:t>
       </w:r>
     </w:p>
     <w:p>
@@ -1065,7 +1120,7 @@
         </w:numPr>
         <w:autoSpaceDE/>
         <w:autoSpaceDN/>
-        <w:spacing w:after="10" w:line="192" w:lineRule="auto"/>
+        <w:spacing w:after="20" w:line="212" w:lineRule="auto"/>
         <w:ind w:hanging="357"/>
         <w:rPr>
           <w:rFonts w:ascii="Times New Roman Regular" w:hAnsi="Times New Roman Regular" w:cs="Times New Roman Regular"/>
@@ -1081,7 +1136,7 @@
           <w:szCs w:val="21"/>
           <w:lang w:eastAsia="zh-CN"/>
         </w:rPr>
-        <w:t xml:space="preserve">Fine-tuned Llama-3, Gemma, and Qwen models using supervised fine-tuning and LoRA; compared unquantized, 8-bit, and 4-bit configurations.</w:t>
+        <w:t>Built a speech-to-text pipeline for cognitive screening, including audio normalization, transcript correction, and a curated Chinese-language subset.</w:t>
       </w:r>
     </w:p>
     <w:p>
@@ -1093,7 +1148,7 @@
         </w:numPr>
         <w:autoSpaceDE/>
         <w:autoSpaceDN/>
-        <w:spacing w:after="10" w:line="192" w:lineRule="auto"/>
+        <w:spacing w:after="20" w:line="212" w:lineRule="auto"/>
         <w:ind w:hanging="357"/>
         <w:rPr>
           <w:rFonts w:ascii="Times New Roman Regular" w:hAnsi="Times New Roman Regular" w:cs="Times New Roman Regular"/>
@@ -1109,73 +1164,7 @@
           <w:szCs w:val="21"/>
           <w:lang w:eastAsia="zh-CN"/>
         </w:rPr>
-        <w:t xml:space="preserve">Compared zero-shot, few-shot, and instruction prompting, and evaluated model configurations using accuracy, F1, precision, and recall.</w:t>
-      </w:r>
-    </w:p>
-    <w:p>
-      <w:pPr>
-        <w:widowControl/>
-        <w:autoSpaceDE/>
-        <w:autoSpaceDN/>
-        <w:spacing w:after="10" w:line="192" w:lineRule="auto"/>
-        <w:rPr>
-          <w:rFonts w:ascii="Times New Roman Bold" w:hAnsi="Times New Roman Bold" w:cs="Times New Roman Bold"/>
-          <w:b/>
-          <w:bCs/>
-          <w:sz w:val="21"/>
-          <w:szCs w:val="21"/>
-          <w:lang w:eastAsia="zh-CN"/>
-        </w:rPr>
-      </w:pPr>
-      <w:r>
-        <w:rPr>
-          <w:rFonts w:ascii="Times New Roman Bold" w:hAnsi="Times New Roman Bold" w:cs="Times New Roman Bold"/>
-          <w:bCs/>
-          <w:sz w:val="21"/>
-          <w:szCs w:val="21"/>
-          <w:lang w:eastAsia="zh-CN"/>
-          <w:b w:val="1"/>
-        </w:rPr>
-        <w:t xml:space="preserve">Position: Multimodal LLMs Should Learn from Children</w:t>
-      </w:r>
-    </w:p>
-    <w:p>
-      <w:pPr>
-        <w:widowControl/>
-        <w:autoSpaceDE/>
-        <w:autoSpaceDN/>
-        <w:spacing w:after="10" w:line="192" w:lineRule="auto"/>
-        <w:rPr>
-          <w:rFonts w:ascii="Times New Roman Regular" w:hAnsi="Times New Roman Regular" w:cs="Times New Roman Regular"/>
-          <w:sz w:val="21"/>
-          <w:szCs w:val="21"/>
-          <w:lang w:eastAsia="zh-CN"/>
-        </w:rPr>
-        <w:tabs>
-          <w:tab w:val="right" w:pos="10880"/>
-        </w:tabs>
-      </w:pPr>
-      <w:r>
-        <w:rPr>
-          <w:rFonts w:ascii="Times New Roman Regular" w:hAnsi="Times New Roman Regular" w:cs="Times New Roman Regular" w:hint="eastAsia"/>
-          <w:sz w:val="21"/>
-          <w:szCs w:val="21"/>
-          <w:lang w:eastAsia="zh-CN"/>
-          <w:b w:val="0"/>
-        </w:rPr>
-        <w:t xml:space="preserve">Collaborative survey and conceptual framework</w:t>
-      </w:r>
-      <w:r>
-        <w:rPr>
-          <w:rFonts w:ascii="Times New Roman Regular" w:hAnsi="Times New Roman Regular" w:cs="Times New Roman Regular" w:hint="eastAsia"/>
-          <w:sz w:val="21"/>
-          <w:szCs w:val="21"/>
-          <w:lang w:eastAsia="zh-CN"/>
-          <w:b w:val="0"/>
-        </w:rPr>
-        <w:t xml:space="preserve"/>
-        <w:tab/>
-        <w:t xml:space="preserve">Nov 2025 - Mar 2026</w:t>
+        <w:t>Compared prompting with supervised fine-tuning and LoRA on Llama-3, Gemma, and Qwen, including unquantized, 8-bit, and 4-bit configurations.</w:t>
       </w:r>
     </w:p>
     <w:p>
@@ -1187,7 +1176,7 @@
         </w:numPr>
         <w:autoSpaceDE/>
         <w:autoSpaceDN/>
-        <w:spacing w:after="10" w:line="192" w:lineRule="auto"/>
+        <w:spacing w:after="20" w:line="212" w:lineRule="auto"/>
         <w:ind w:hanging="357"/>
         <w:rPr>
           <w:rFonts w:ascii="Times New Roman Regular" w:hAnsi="Times New Roman Regular" w:cs="Times New Roman Regular"/>
@@ -1203,7 +1192,50 @@
           <w:szCs w:val="21"/>
           <w:lang w:eastAsia="zh-CN"/>
         </w:rPr>
-        <w:t xml:space="preserve">Surveyed developmental learning for multimodal models, focusing on grounding, supervision inference, memory, and continual adaptation.</w:t>
+        <w:t>Implemented balanced 5-fold cross-validation to evaluate screening performance across prompting, adaptation, and quantization settings.</w:t>
+      </w:r>
+    </w:p>
+    <w:p>
+      <w:pPr>
+        <w:widowControl/>
+        <w:autoSpaceDE/>
+        <w:autoSpaceDN/>
+        <w:spacing w:after="20" w:line="212" w:lineRule="auto" w:before="60"/>
+        <w:rPr>
+          <w:rFonts w:ascii="Times New Roman Bold" w:hAnsi="Times New Roman Bold" w:cs="Times New Roman Bold"/>
+          <w:b/>
+          <w:bCs/>
+          <w:sz w:val="21"/>
+          <w:szCs w:val="21"/>
+          <w:lang w:eastAsia="zh-CN"/>
+        </w:rPr>
+        <w:tabs>
+          <w:tab w:val="right" w:pos="10880"/>
+        </w:tabs>
+        <w:keepNext/>
+      </w:pPr>
+      <w:r>
+        <w:rPr>
+          <w:rFonts w:ascii="Times New Roman Bold" w:hAnsi="Times New Roman Bold" w:cs="Times New Roman Bold"/>
+          <w:bCs/>
+          <w:sz w:val="21"/>
+          <w:szCs w:val="21"/>
+          <w:lang w:eastAsia="zh-CN"/>
+          <w:b w:val="1"/>
+        </w:rPr>
+        <w:t xml:space="preserve">RepoFusion-in-Decoder</w:t>
+      </w:r>
+      <w:r>
+        <w:rPr>
+          <w:rFonts w:ascii="Times New Roman Regular" w:hAnsi="Times New Roman Regular" w:cs="Times New Roman Regular" w:hint="eastAsia"/>
+          <w:sz w:val="21"/>
+          <w:szCs w:val="21"/>
+          <w:lang w:eastAsia="zh-CN"/>
+          <w:b w:val="0"/>
+        </w:rPr>
+        <w:t xml:space="preserve"/>
+        <w:tab/>
+        <w:t xml:space="preserve">Apr 2025 - Aug 2025</w:t>
       </w:r>
     </w:p>
     <w:p>
@@ -1215,7 +1247,7 @@
         </w:numPr>
         <w:autoSpaceDE/>
         <w:autoSpaceDN/>
-        <w:spacing w:after="10" w:line="192" w:lineRule="auto"/>
+        <w:spacing w:after="20" w:line="212" w:lineRule="auto"/>
         <w:ind w:hanging="357"/>
         <w:rPr>
           <w:rFonts w:ascii="Times New Roman Regular" w:hAnsi="Times New Roman Regular" w:cs="Times New Roman Regular"/>
@@ -1231,73 +1263,7 @@
           <w:szCs w:val="21"/>
           <w:lang w:eastAsia="zh-CN"/>
         </w:rPr>
-        <w:t xml:space="preserve">Contributed to a framework spanning task formation, supervision inference, and continuous growth; analyzed limitations in sequential multimodal data and evaluation benchmarks.</w:t>
-      </w:r>
-    </w:p>
-    <w:p>
-      <w:pPr>
-        <w:widowControl/>
-        <w:autoSpaceDE/>
-        <w:autoSpaceDN/>
-        <w:spacing w:after="10" w:line="192" w:lineRule="auto"/>
-        <w:rPr>
-          <w:rFonts w:ascii="Times New Roman Bold" w:hAnsi="Times New Roman Bold" w:cs="Times New Roman Bold"/>
-          <w:b/>
-          <w:bCs/>
-          <w:sz w:val="21"/>
-          <w:szCs w:val="21"/>
-          <w:lang w:eastAsia="zh-CN"/>
-        </w:rPr>
-      </w:pPr>
-      <w:r>
-        <w:rPr>
-          <w:rFonts w:ascii="Times New Roman Bold" w:hAnsi="Times New Roman Bold" w:cs="Times New Roman Bold"/>
-          <w:bCs/>
-          <w:sz w:val="21"/>
-          <w:szCs w:val="21"/>
-          <w:lang w:eastAsia="zh-CN"/>
-          <w:b w:val="1"/>
-        </w:rPr>
-        <w:t xml:space="preserve">Language Model Reliability and Rejection Behavior</w:t>
-      </w:r>
-    </w:p>
-    <w:p>
-      <w:pPr>
-        <w:widowControl/>
-        <w:autoSpaceDE/>
-        <w:autoSpaceDN/>
-        <w:spacing w:after="10" w:line="192" w:lineRule="auto"/>
-        <w:rPr>
-          <w:rFonts w:ascii="Times New Roman Regular" w:hAnsi="Times New Roman Regular" w:cs="Times New Roman Regular"/>
-          <w:sz w:val="21"/>
-          <w:szCs w:val="21"/>
-          <w:lang w:eastAsia="zh-CN"/>
-        </w:rPr>
-        <w:tabs>
-          <w:tab w:val="right" w:pos="10880"/>
-        </w:tabs>
-      </w:pPr>
-      <w:r>
-        <w:rPr>
-          <w:rFonts w:ascii="Times New Roman Regular" w:hAnsi="Times New Roman Regular" w:cs="Times New Roman Regular" w:hint="eastAsia"/>
-          <w:sz w:val="21"/>
-          <w:szCs w:val="21"/>
-          <w:lang w:eastAsia="zh-CN"/>
-          <w:b w:val="0"/>
-        </w:rPr>
-        <w:t xml:space="preserve">Co-first author | Advisor: Dr. Baha Ihnaini</w:t>
-      </w:r>
-      <w:r>
-        <w:rPr>
-          <w:rFonts w:ascii="Times New Roman Regular" w:hAnsi="Times New Roman Regular" w:cs="Times New Roman Regular" w:hint="eastAsia"/>
-          <w:sz w:val="21"/>
-          <w:szCs w:val="21"/>
-          <w:lang w:eastAsia="zh-CN"/>
-          <w:b w:val="0"/>
-        </w:rPr>
-        <w:t xml:space="preserve"/>
-        <w:tab/>
-        <w:t xml:space="preserve">Nov 2024 - May 2025</w:t>
+        <w:t>Implemented lightweight encoder fusion and cross-attention to incorporate retrieved repository context into a frozen code language model for cross-file completion.</w:t>
       </w:r>
     </w:p>
     <w:p>
@@ -1309,7 +1275,7 @@
         </w:numPr>
         <w:autoSpaceDE/>
         <w:autoSpaceDN/>
-        <w:spacing w:after="10" w:line="192" w:lineRule="auto"/>
+        <w:spacing w:after="20" w:line="212" w:lineRule="auto"/>
         <w:ind w:hanging="357"/>
         <w:rPr>
           <w:rFonts w:ascii="Times New Roman Regular" w:hAnsi="Times New Roman Regular" w:cs="Times New Roman Regular"/>
@@ -1325,7 +1291,7 @@
           <w:szCs w:val="21"/>
           <w:lang w:eastAsia="zh-CN"/>
         </w:rPr>
-        <w:t xml:space="preserve">Conducted a literature review across five scholarly databases, applying inclusion criteria, citation tracing, and structured extraction of models, datasets, and metrics.</w:t>
+        <w:t>Built BM25 retrieval and sliding-window chunking; cached encoder states to reuse repository context across completion requests.</w:t>
       </w:r>
     </w:p>
     <w:p>
@@ -1337,7 +1303,7 @@
         </w:numPr>
         <w:autoSpaceDE/>
         <w:autoSpaceDN/>
-        <w:spacing w:after="10" w:line="192" w:lineRule="auto"/>
+        <w:spacing w:after="20" w:line="212" w:lineRule="auto"/>
         <w:ind w:hanging="357"/>
         <w:rPr>
           <w:rFonts w:ascii="Times New Roman Regular" w:hAnsi="Times New Roman Regular" w:cs="Times New Roman Regular"/>
@@ -1353,51 +1319,35 @@
           <w:szCs w:val="21"/>
           <w:lang w:eastAsia="zh-CN"/>
         </w:rPr>
-        <w:t xml:space="preserve">Compared fine-tuning, RAG, and RAFT for rejection behavior, hallucination mitigation, computational cost, and domain adaptability; co-developed a four-dimensional review framework.</w:t>
-      </w:r>
-    </w:p>
-    <w:p>
-      <w:pPr>
-        <w:rPr>
-          <w:rFonts w:ascii="Times New Roman Regular" w:eastAsia="宋体" w:hAnsi="Times New Roman Regular" w:cs="Times New Roman Regular"/>
+        <w:t>Benchmarked completion quality and prefill latency on Long Code Arena and RepoEval-Updated; ablated cross-attention depth to assess the quality-efficiency trade-off.</w:t>
+      </w:r>
+    </w:p>
+    <w:p>
+      <w:pPr>
+        <w:rPr>
+          <w:rFonts w:ascii="Times New Roman Bold" w:hAnsi="Times New Roman Bold" w:cs="Times New Roman Bold"/>
           <w:b/>
           <w:bCs/>
           <w:sz w:val="21"/>
           <w:szCs w:val="21"/>
           <w:lang w:eastAsia="zh-CN"/>
-        </w:rPr>
-      </w:pPr>
-      <w:r>
-        <w:rPr>
-          <w:rFonts w:ascii="Times New Roman Regular" w:hAnsi="Times New Roman Regular" w:cs="Times New Roman Regular" w:hint="eastAsia"/>
-          <w:bCs/>
-          <w:sz w:val="21"/>
-          <w:szCs w:val="21"/>
-          <w:b w:val="1"/>
-        </w:rPr>
-        <w:t xml:space="preserve">Reinforcement Learning for UAV Planning</w:t>
-      </w:r>
-    </w:p>
-    <w:p>
-      <w:pPr>
-        <w:rPr>
-          <w:rFonts w:ascii="Times New Roman Regular" w:hAnsi="Times New Roman Regular" w:cs="Times New Roman Regular"/>
-          <w:sz w:val="21"/>
-          <w:szCs w:val="21"/>
         </w:rPr>
         <w:tabs>
           <w:tab w:val="right" w:pos="10880"/>
         </w:tabs>
-      </w:pPr>
-      <w:r>
-        <w:rPr>
-          <w:rFonts w:ascii="Times New Roman Regular" w:hAnsi="Times New Roman Regular" w:cs="Times New Roman Regular" w:hint="eastAsia"/>
-          <w:sz w:val="21"/>
-          <w:szCs w:val="21"/>
-          <w:lang w:eastAsia="zh-CN"/>
-          <w:b w:val="0"/>
-        </w:rPr>
-        <w:t xml:space="preserve">Research project</w:t>
+        <w:spacing w:before="60" w:after="20"/>
+        <w:keepNext/>
+      </w:pPr>
+      <w:r>
+        <w:rPr>
+          <w:rFonts w:ascii="Times New Roman Bold" w:hAnsi="Times New Roman Bold" w:cs="Times New Roman Bold"/>
+          <w:bCs/>
+          <w:sz w:val="21"/>
+          <w:szCs w:val="21"/>
+          <w:lang w:eastAsia="zh-CN"/>
+          <w:b w:val="1"/>
+        </w:rPr>
+        <w:t xml:space="preserve">CT Image Reconstruction</w:t>
       </w:r>
       <w:r>
         <w:rPr>
@@ -1409,7 +1359,7 @@
         </w:rPr>
         <w:t xml:space="preserve"/>
         <w:tab/>
-        <w:t xml:space="preserve">Sep 2024 - Oct 2025</w:t>
+        <w:t xml:space="preserve">Feb 2025 - Jun 2025</w:t>
       </w:r>
     </w:p>
     <w:p>
@@ -1421,7 +1371,7 @@
         </w:numPr>
         <w:autoSpaceDE/>
         <w:autoSpaceDN/>
-        <w:spacing w:after="10" w:line="192" w:lineRule="auto"/>
+        <w:spacing w:after="20" w:line="212" w:lineRule="auto"/>
         <w:ind w:hanging="357"/>
         <w:rPr>
           <w:rFonts w:ascii="Times New Roman Regular" w:hAnsi="Times New Roman Regular" w:cs="Times New Roman Regular"/>
@@ -1432,45 +1382,20 @@
       </w:pPr>
       <w:r>
         <w:rPr>
-          <w:rFonts w:ascii="Times New Roman Regular" w:hAnsi="Times New Roman Regular" w:cs="Times New Roman Regular" w:hint="eastAsia"/>
-          <w:sz w:val="21"/>
-          <w:szCs w:val="21"/>
-          <w:lang w:eastAsia="zh-CN"/>
-        </w:rPr>
-        <w:t xml:space="preserve">Implemented an enhanced Noisy DQN and an evaluation pipeline for a communication-constrained 15 x 15 grid environment, with comparisons against DQN, NoisyNet, and Double DQN.</w:t>
-      </w:r>
-    </w:p>
-    <w:p>
-      <w:pPr>
-        <w:rPr>
-          <w:rFonts w:ascii="Times New Roman Bold" w:hAnsi="Times New Roman Bold" w:cs="Times New Roman Bold"/>
+          <w:rFonts w:ascii="Times New Roman Regular" w:hAnsi="Times New Roman Regular" w:cs="Times New Roman Regular"/>
+          <w:sz w:val="21"/>
+          <w:szCs w:val="21"/>
+          <w:lang w:eastAsia="zh-CN"/>
+        </w:rPr>
+        <w:t>Implemented a U-Net with kernel basis attention and multi-axis fusion for low-dose and sparse-view CT; evaluated MSE, SSIM, and a CNN observer task.</w:t>
+      </w:r>
+    </w:p>
+    <w:p>
+      <w:pPr>
+        <w:rPr>
+          <w:rFonts w:ascii="Times New Roman Regular" w:eastAsia="宋体" w:hAnsi="Times New Roman Regular" w:cs="Times New Roman Regular"/>
           <w:b/>
           <w:bCs/>
-          <w:sz w:val="21"/>
-          <w:szCs w:val="21"/>
-          <w:lang w:eastAsia="zh-CN"/>
-        </w:rPr>
-      </w:pPr>
-      <w:r>
-        <w:rPr>
-          <w:rFonts w:ascii="Times New Roman Bold" w:hAnsi="Times New Roman Bold" w:cs="Times New Roman Bold"/>
-          <w:bCs/>
-          <w:sz w:val="21"/>
-          <w:szCs w:val="21"/>
-          <w:lang w:eastAsia="zh-CN"/>
-          <w:b w:val="1"/>
-        </w:rPr>
-        <w:t xml:space="preserve">CT Image Reconstruction</w:t>
-      </w:r>
-    </w:p>
-    <w:p>
-      <w:pPr>
-        <w:widowControl/>
-        <w:autoSpaceDE/>
-        <w:autoSpaceDN/>
-        <w:spacing w:after="10" w:line="192" w:lineRule="auto"/>
-        <w:rPr>
-          <w:rFonts w:ascii="Times New Roman" w:eastAsiaTheme="minorEastAsia" w:hAnsi="Times New Roman" w:cs="Times New Roman"/>
           <w:sz w:val="21"/>
           <w:szCs w:val="21"/>
           <w:lang w:eastAsia="zh-CN"/>
@@ -1478,16 +1403,18 @@
         <w:tabs>
           <w:tab w:val="right" w:pos="10880"/>
         </w:tabs>
-      </w:pPr>
-      <w:r>
-        <w:rPr>
-          <w:rFonts w:ascii="Times New Roman Regular" w:hAnsi="Times New Roman Regular" w:cs="Times New Roman Regular" w:hint="eastAsia"/>
-          <w:sz w:val="21"/>
-          <w:szCs w:val="21"/>
-          <w:lang w:eastAsia="zh-CN"/>
-          <w:b w:val="0"/>
-        </w:rPr>
-        <w:t xml:space="preserve">Research project</w:t>
+        <w:spacing w:before="60" w:after="20"/>
+        <w:keepNext/>
+      </w:pPr>
+      <w:r>
+        <w:rPr>
+          <w:rFonts w:ascii="Times New Roman Regular" w:hAnsi="Times New Roman Regular" w:cs="Times New Roman Regular" w:hint="eastAsia"/>
+          <w:bCs/>
+          <w:sz w:val="21"/>
+          <w:szCs w:val="21"/>
+          <w:b w:val="1"/>
+        </w:rPr>
+        <w:t xml:space="preserve">Reinforcement Learning for UAV Planning</w:t>
       </w:r>
       <w:r>
         <w:rPr>
@@ -1499,7 +1426,7 @@
         </w:rPr>
         <w:t xml:space="preserve"/>
         <w:tab/>
-        <w:t xml:space="preserve">Feb 2025 - Jun 2025</w:t>
+        <w:t xml:space="preserve">Sep 2024 - Oct 2025</w:t>
       </w:r>
     </w:p>
     <w:p>
@@ -1511,7 +1438,7 @@
         </w:numPr>
         <w:autoSpaceDE/>
         <w:autoSpaceDN/>
-        <w:spacing w:after="10" w:line="192" w:lineRule="auto"/>
+        <w:spacing w:after="20" w:line="212" w:lineRule="auto"/>
         <w:ind w:hanging="357"/>
         <w:rPr>
           <w:rFonts w:ascii="Times New Roman Regular" w:hAnsi="Times New Roman Regular" w:cs="Times New Roman Regular"/>
@@ -1522,12 +1449,12 @@
       </w:pPr>
       <w:r>
         <w:rPr>
-          <w:rFonts w:ascii="Times New Roman Regular" w:hAnsi="Times New Roman Regular" w:cs="Times New Roman Regular"/>
-          <w:sz w:val="21"/>
-          <w:szCs w:val="21"/>
-          <w:lang w:eastAsia="zh-CN"/>
-        </w:rPr>
-        <w:t xml:space="preserve">Implemented a U-Net with kernel basis attention and multi-axis feature fusion; evaluated low-dose and sparse-view reconstruction using MSE, SSIM, and a CNN observer task.</w:t>
+          <w:rFonts w:ascii="Times New Roman Regular" w:hAnsi="Times New Roman Regular" w:cs="Times New Roman Regular" w:hint="eastAsia"/>
+          <w:sz w:val="21"/>
+          <w:szCs w:val="21"/>
+          <w:lang w:eastAsia="zh-CN"/>
+        </w:rPr>
+        <w:t>Implemented enhanced Noisy DQN for communication-constrained UAV planning; evaluated against DQN, NoisyNet, and Double DQN in a 15 x 15 grid.</w:t>
       </w:r>
     </w:p>
     <w:p>
@@ -1538,7 +1465,7 @@
         </w:pBdr>
         <w:autoSpaceDE/>
         <w:autoSpaceDN/>
-        <w:spacing w:after="40"/>
+        <w:spacing w:after="50" w:before="60"/>
         <w:outlineLvl w:val="0"/>
         <w:rPr>
           <w:rFonts w:ascii="Times New Roman Regular" w:hAnsi="Times New Roman Regular" w:cs="Times New Roman Regular"/>
@@ -1567,7 +1494,7 @@
         </w:numPr>
         <w:autoSpaceDE/>
         <w:autoSpaceDN/>
-        <w:spacing w:after="10" w:line="192" w:lineRule="auto"/>
+        <w:spacing w:after="20" w:line="212" w:lineRule="auto"/>
         <w:ind w:hanging="357"/>
         <w:rPr>
           <w:rFonts w:ascii="Times New Roman Regular" w:hAnsi="Times New Roman Regular" w:cs="Times New Roman Regular"/>
@@ -1583,7 +1510,7 @@
           <w:szCs w:val="21"/>
           <w:lang w:eastAsia="zh-CN"/>
         </w:rPr>
-        <w:t xml:space="preserve">Programming and environment: Python, Java, Linux.</w:t>
+        <w:t>Methods: LLM fine-tuning, LoRA, quantization, retrieval-augmented modeling, token attribution.</w:t>
       </w:r>
     </w:p>
     <w:p>
@@ -1595,7 +1522,7 @@
         </w:numPr>
         <w:autoSpaceDE/>
         <w:autoSpaceDN/>
-        <w:spacing w:after="10" w:line="192" w:lineRule="auto"/>
+        <w:spacing w:after="20" w:line="212" w:lineRule="auto"/>
         <w:ind w:hanging="357"/>
         <w:rPr>
           <w:rFonts w:ascii="Times New Roman Regular" w:hAnsi="Times New Roman Regular" w:cs="Times New Roman Regular"/>
@@ -1606,40 +1533,12 @@
       </w:pPr>
       <w:r>
         <w:rPr>
-          <w:rFonts w:ascii="Times New Roman Regular" w:hAnsi="Times New Roman Regular" w:cs="Times New Roman Regular" w:hint="eastAsia"/>
-          <w:sz w:val="21"/>
-          <w:szCs w:val="21"/>
-          <w:lang w:eastAsia="zh-CN"/>
-        </w:rPr>
-        <w:t xml:space="preserve">Research methods: LLM fine-tuning, LoRA, quantization, retrieval, cross-validation, ablation studies, token attribution.</w:t>
-      </w:r>
-    </w:p>
-    <w:p>
-      <w:pPr>
-        <w:widowControl/>
-        <w:numPr>
-          <w:ilvl w:val="0"/>
-          <w:numId w:val="1"/>
-        </w:numPr>
-        <w:autoSpaceDE/>
-        <w:autoSpaceDN/>
-        <w:spacing w:after="10" w:line="192" w:lineRule="auto"/>
-        <w:ind w:hanging="357"/>
-        <w:rPr>
-          <w:rFonts w:ascii="Times New Roman Regular" w:hAnsi="Times New Roman Regular" w:cs="Times New Roman Regular"/>
-          <w:sz w:val="21"/>
-          <w:szCs w:val="21"/>
-          <w:lang w:eastAsia="zh-CN"/>
-        </w:rPr>
-      </w:pPr>
-      <w:r>
-        <w:rPr>
-          <w:rFonts w:ascii="Times New Roman Regular" w:hAnsi="Times New Roman Regular" w:cs="Times New Roman Regular"/>
-          <w:sz w:val="21"/>
-          <w:szCs w:val="21"/>
-          <w:lang w:eastAsia="zh-CN"/>
-        </w:rPr>
-        <w:t xml:space="preserve">Research Interests: Multimodal Large Language Models; Computer Vision; Natural Language Processing; Reinforcement Learning; Reliable Large Language Models.</w:t>
+          <w:rFonts w:ascii="Times New Roman Regular" w:hAnsi="Times New Roman Regular" w:cs="Times New Roman Regular"/>
+          <w:sz w:val="21"/>
+          <w:szCs w:val="21"/>
+          <w:lang w:eastAsia="zh-CN"/>
+        </w:rPr>
+        <w:t xml:space="preserve">Research Interests: Multimodal Large Language Models; Computer Vision; Reinforcement Learning; Reliable Large Language Models.</w:t>
       </w:r>
     </w:p>
     <w:sectPr>

</xml_diff>

<commit_message>
Add Google Scholar link to CV
</commit_message>
<xml_diff>
--- a/files/Zhuoqing_Zhong_CV.docx
+++ b/files/Zhuoqing_Zhong_CV.docx
@@ -98,6 +98,26 @@
             <w:lang w:eastAsia="zh-CN"/>
           </w:rPr>
           <w:t xml:space="preserve">Webpage</w:t>
+        </w:r>
+      </w:hyperlink>
+      <w:r>
+        <w:rPr>
+          <w:rFonts w:ascii="Times New Roman" w:hAnsi="Times New Roman" w:hint="eastAsia"/>
+          <w:sz w:val="20"/>
+          <w:szCs w:val="20"/>
+          <w:lang w:eastAsia="zh-CN"/>
+        </w:rPr>
+        <w:t xml:space="preserve"> | </w:t>
+      </w:r>
+      <w:hyperlink r:id="rIdGoogleScholar">
+        <w:r>
+          <w:rPr>
+            <w:rFonts w:ascii="Times New Roman" w:hAnsi="Times New Roman" w:hint="eastAsia"/>
+            <w:sz w:val="20"/>
+            <w:szCs w:val="20"/>
+            <w:lang w:eastAsia="zh-CN"/>
+          </w:rPr>
+          <w:t xml:space="preserve">Google Scholar</w:t>
         </w:r>
       </w:hyperlink>
     </w:p>

</xml_diff>

<commit_message>
Simplify profile, remove Scholar links, and align education dates
</commit_message>
<xml_diff>
--- a/files/Zhuoqing_Zhong_CV.docx
+++ b/files/Zhuoqing_Zhong_CV.docx
@@ -4,7 +4,7 @@
   <w:body>
     <w:p>
       <w:pPr>
-        <w:spacing w:after="10"/>
+        <w:spacing w:after="20" w:before="0" w:line="240" w:lineRule="auto"/>
         <w:jc w:val="center"/>
         <w:outlineLvl w:val="0"/>
         <w:rPr>
@@ -22,7 +22,7 @@
           <w:b/>
           <w:smallCaps/>
           <w:sz w:val="36"/>
-          <w:szCs w:val="36"/>
+          <w:szCs w:val="21"/>
           <w:lang w:eastAsia="zh-CN"/>
         </w:rPr>
         <w:t xml:space="preserve">Zhuoqing Zhong</w:t>
@@ -30,7 +30,7 @@
     </w:p>
     <w:p>
       <w:pPr>
-        <w:spacing w:after="10"/>
+        <w:spacing w:after="20" w:before="0" w:line="240" w:lineRule="auto"/>
         <w:jc w:val="center"/>
         <w:outlineLvl w:val="0"/>
         <w:rPr>
@@ -44,7 +44,7 @@
         <w:rPr>
           <w:rFonts w:ascii="Times New Roman" w:hAnsi="Times New Roman" w:hint="eastAsia"/>
           <w:sz w:val="20"/>
-          <w:szCs w:val="20"/>
+          <w:szCs w:val="21"/>
           <w:lang w:eastAsia="zh-CN"/>
         </w:rPr>
         <w:t xml:space="preserve">Email: </w:t>
@@ -54,7 +54,7 @@
           <w:rPr>
             <w:rFonts w:ascii="Times New Roman" w:hAnsi="Times New Roman" w:hint="eastAsia"/>
             <w:sz w:val="20"/>
-            <w:szCs w:val="20"/>
+            <w:szCs w:val="21"/>
             <w:lang w:eastAsia="zh-CN"/>
           </w:rPr>
           <w:t xml:space="preserve">zhuoqinz@andrew.cmu.edu</w:t>
@@ -64,7 +64,7 @@
         <w:rPr>
           <w:rFonts w:ascii="Times New Roman" w:hAnsi="Times New Roman" w:hint="eastAsia"/>
           <w:sz w:val="20"/>
-          <w:szCs w:val="20"/>
+          <w:szCs w:val="21"/>
           <w:lang w:eastAsia="zh-CN"/>
         </w:rPr>
         <w:t xml:space="preserve"> | </w:t>
@@ -74,7 +74,7 @@
           <w:rPr>
             <w:rFonts w:ascii="Times New Roman" w:hAnsi="Times New Roman" w:hint="eastAsia"/>
             <w:sz w:val="20"/>
-            <w:szCs w:val="20"/>
+            <w:szCs w:val="21"/>
             <w:lang w:eastAsia="zh-CN"/>
           </w:rPr>
           <w:t xml:space="preserve">LinkedIn</w:t>
@@ -84,7 +84,7 @@
         <w:rPr>
           <w:rFonts w:ascii="Times New Roman" w:hAnsi="Times New Roman" w:hint="eastAsia"/>
           <w:sz w:val="20"/>
-          <w:szCs w:val="20"/>
+          <w:szCs w:val="21"/>
           <w:lang w:eastAsia="zh-CN"/>
         </w:rPr>
         <w:t xml:space="preserve"> | </w:t>
@@ -94,7 +94,7 @@
           <w:rPr>
             <w:rFonts w:ascii="Times New Roman" w:hAnsi="Times New Roman" w:hint="eastAsia"/>
             <w:sz w:val="20"/>
-            <w:szCs w:val="20"/>
+            <w:szCs w:val="21"/>
             <w:lang w:eastAsia="zh-CN"/>
           </w:rPr>
           <w:t xml:space="preserve">Webpage</w:t>
@@ -104,22 +104,11 @@
         <w:rPr>
           <w:rFonts w:ascii="Times New Roman" w:hAnsi="Times New Roman" w:hint="eastAsia"/>
           <w:sz w:val="20"/>
-          <w:szCs w:val="20"/>
-          <w:lang w:eastAsia="zh-CN"/>
-        </w:rPr>
-        <w:t xml:space="preserve"> | </w:t>
-      </w:r>
-      <w:hyperlink r:id="rIdGoogleScholar">
-        <w:r>
-          <w:rPr>
-            <w:rFonts w:ascii="Times New Roman" w:hAnsi="Times New Roman" w:hint="eastAsia"/>
-            <w:sz w:val="20"/>
-            <w:szCs w:val="20"/>
-            <w:lang w:eastAsia="zh-CN"/>
-          </w:rPr>
-          <w:t xml:space="preserve">Google Scholar</w:t>
-        </w:r>
-      </w:hyperlink>
+          <w:szCs w:val="21"/>
+          <w:lang w:eastAsia="zh-CN"/>
+        </w:rPr>
+        <w:t xml:space="preserve"/>
+      </w:r>
     </w:p>
     <w:p>
       <w:pPr>
@@ -129,14 +118,14 @@
         </w:pBdr>
         <w:autoSpaceDE/>
         <w:autoSpaceDN/>
-        <w:spacing w:after="50" w:before="60"/>
+        <w:spacing w:after="20" w:before="90" w:line="240" w:lineRule="auto"/>
         <w:outlineLvl w:val="0"/>
         <w:rPr>
           <w:rFonts w:ascii="Times New Roman Regular" w:hAnsi="Times New Roman Regular" w:cs="Times New Roman Regular"/>
           <w:sz w:val="21"/>
           <w:szCs w:val="21"/>
         </w:rPr>
-        <w:keepNext/>
+        <w:keepNext w:val="1"/>
       </w:pPr>
       <w:r>
         <w:rPr>
@@ -154,7 +143,7 @@
         <w:widowControl/>
         <w:autoSpaceDE/>
         <w:autoSpaceDN/>
-        <w:spacing w:after="10" w:line="212" w:lineRule="auto"/>
+        <w:spacing w:after="20" w:line="240" w:lineRule="auto" w:before="0"/>
         <w:rPr>
           <w:rFonts w:ascii="Times New Roman Regular" w:hAnsi="Times New Roman Regular" w:cs="Times New Roman Regular"/>
           <w:sz w:val="21"/>
@@ -182,7 +171,7 @@
         <w:br/>
         <w:t xml:space="preserve">M.S. in Electrical and Computer Engineering</w:t>
         <w:br/>
-        <w:t xml:space="preserve">Spring 2027 entering class</w:t>
+        <w:t xml:space="preserve">Sep 2026 - Present</w:t>
       </w:r>
     </w:p>
     <w:p>
@@ -196,7 +185,7 @@
           <w:szCs w:val="21"/>
           <w:lang w:eastAsia="zh-CN"/>
         </w:rPr>
-        <w:spacing/>
+        <w:spacing w:before="0" w:after="20" w:line="240" w:lineRule="auto"/>
       </w:pPr>
       <w:r>
         <w:rPr>
@@ -218,9 +207,9 @@
           <w:lang w:eastAsia="zh-CN"/>
         </w:rPr>
         <w:tabs>
-          <w:tab w:val="right" w:pos="10880"/>
+          <w:tab w:val="right" w:pos="10748"/>
         </w:tabs>
-        <w:spacing/>
+        <w:spacing w:before="0" w:after="20" w:line="240" w:lineRule="auto"/>
       </w:pPr>
       <w:r>
         <w:rPr>
@@ -252,7 +241,7 @@
         </w:numPr>
         <w:autoSpaceDE/>
         <w:autoSpaceDN/>
-        <w:spacing w:after="20" w:line="212" w:lineRule="auto"/>
+        <w:spacing w:after="20" w:line="240" w:lineRule="auto" w:before="0"/>
         <w:ind w:hanging="357"/>
         <w:rPr>
           <w:rFonts w:ascii="Times New Roman Regular" w:hAnsi="Times New Roman Regular" w:cs="Times New Roman Regular"/>
@@ -267,7 +256,7 @@
           <w:szCs w:val="21"/>
           <w:lang w:eastAsia="zh-CN" w:bidi="ar-SA"/>
         </w:rPr>
-        <w:t xml:space="preserve">Overall GPA: 3.93/4.00; Minor: Mathematical Sciences</w:t>
+        <w:t xml:space="preserve">Overall GPA: 3.859/4.000; Minor: Mathematical Sciences</w:t>
       </w:r>
     </w:p>
     <w:p>
@@ -279,7 +268,7 @@
         </w:numPr>
         <w:autoSpaceDE/>
         <w:autoSpaceDN/>
-        <w:spacing w:after="20" w:line="212" w:lineRule="auto"/>
+        <w:spacing w:after="20" w:line="240" w:lineRule="auto" w:before="0"/>
         <w:ind w:hanging="357"/>
         <w:rPr>
           <w:rFonts w:ascii="Times New Roman Regular" w:hAnsi="Times New Roman Regular" w:cs="Times New Roman Regular"/>
@@ -299,13 +288,13 @@
     </w:p>
     <w:p>
       <w:pPr>
-        <w:widowControl/>
+        <w:widowControl w:val="1"/>
         <w:pBdr>
           <w:bottom w:val="single" w:sz="6" w:space="1" w:color="auto"/>
         </w:pBdr>
         <w:autoSpaceDE/>
         <w:autoSpaceDN/>
-        <w:spacing w:after="50" w:before="60"/>
+        <w:spacing w:after="20" w:before="90" w:line="240" w:lineRule="auto"/>
         <w:outlineLvl w:val="0"/>
         <w:rPr>
           <w:rFonts w:ascii="Times New Roman Regular" w:hAnsi="Times New Roman Regular" w:cs="Times New Roman Regular"/>
@@ -313,7 +302,7 @@
           <w:szCs w:val="21"/>
           <w:lang w:eastAsia="zh-CN"/>
         </w:rPr>
-        <w:keepNext/>
+        <w:keepNext w:val="1"/>
       </w:pPr>
       <w:r>
         <w:rPr>
@@ -323,19 +312,19 @@
           <w:szCs w:val="21"/>
           <w:lang w:eastAsia="zh-CN"/>
         </w:rPr>
-        <w:t xml:space="preserve">PUBLICATIONS</w:t>
-      </w:r>
-    </w:p>
-    <w:p>
-      <w:pPr>
-        <w:widowControl/>
+        <w:t xml:space="preserve">SELECTED PUBLICATIONS</w:t>
+      </w:r>
+    </w:p>
+    <w:p>
+      <w:pPr>
+        <w:widowControl w:val="1"/>
         <w:numPr>
           <w:ilvl w:val="0"/>
           <w:numId w:val="1"/>
         </w:numPr>
         <w:autoSpaceDE/>
         <w:autoSpaceDN/>
-        <w:spacing w:after="20" w:line="212" w:lineRule="auto"/>
+        <w:spacing w:after="20" w:line="240" w:lineRule="auto" w:before="0"/>
         <w:ind w:hanging="357"/>
         <w:rPr>
           <w:rFonts w:ascii="Times New Roman Regular" w:hAnsi="Times New Roman Regular" w:cs="Times New Roman Regular"/>
@@ -346,7 +335,73 @@
       </w:pPr>
       <w:r>
         <w:rPr>
-          <w:rFonts w:ascii="Times New Roman Regular" w:hAnsi="Times New Roman Regular" w:cs="Times New Roman Regular" w:hint="eastAsia"/>
+          <w:rFonts w:ascii="Times New Roman" w:hAnsi="Times New Roman" w:cs="Times New Roman Regular" w:hint="eastAsia"/>
+          <w:sz w:val="21"/>
+          <w:szCs w:val="21"/>
+          <w:lang w:eastAsia="zh-CN"/>
+        </w:rPr>
+        <w:t xml:space="preserve">Baha Ihnaini, Wei Liu, </w:t>
+      </w:r>
+      <w:r>
+        <w:rPr>
+          <w:rFonts w:ascii="Times New Roman" w:hAnsi="Times New Roman" w:cs="Times New Roman Regular" w:hint="eastAsia"/>
+          <w:sz w:val="21"/>
+          <w:szCs w:val="21"/>
+          <w:lang w:eastAsia="zh-CN"/>
+          <w:b/>
+        </w:rPr>
+        <w:t>Zhuoqing Zhong</w:t>
+      </w:r>
+      <w:r>
+        <w:rPr>
+          <w:rFonts w:ascii="Times New Roman" w:hAnsi="Times New Roman" w:cs="Times New Roman Regular" w:hint="eastAsia"/>
+          <w:sz w:val="21"/>
+          <w:szCs w:val="21"/>
+          <w:lang w:eastAsia="zh-CN"/>
+        </w:rPr>
+        <w:t xml:space="preserve">*, Zihui Deng, Jiayi Xu, and Ruoling Zhao. "Evaluating Mild Cognitive Impairment using large language models: A comparative analysis." Biomedical Signal Processing and Control, 130, 111602, 2027.</w:t>
+      </w:r>
+      <w:r>
+        <w:t xml:space="preserve"> </w:t>
+        <w:rPr>
+          <w:rFonts w:ascii="Times New Roman" w:hAnsi="Times New Roman"/>
+          <w:sz w:val="21"/>
+          <w:szCs w:val="21"/>
+        </w:rPr>
+      </w:r>
+      <w:hyperlink r:id="rIdPublication14">
+        <w:r>
+          <w:rPr>
+            <w:u w:val="single"/>
+            <w:rFonts w:ascii="Times New Roman" w:hAnsi="Times New Roman"/>
+            <w:sz w:val="21"/>
+            <w:szCs w:val="21"/>
+          </w:rPr>
+          <w:t>[Paper]</w:t>
+        </w:r>
+      </w:hyperlink>
+    </w:p>
+    <w:p>
+      <w:pPr>
+        <w:widowControl w:val="1"/>
+        <w:numPr>
+          <w:ilvl w:val="0"/>
+          <w:numId w:val="1"/>
+        </w:numPr>
+        <w:autoSpaceDE/>
+        <w:autoSpaceDN/>
+        <w:spacing w:after="20" w:line="240" w:lineRule="auto" w:before="0"/>
+        <w:ind w:hanging="357"/>
+        <w:rPr>
+          <w:rFonts w:ascii="Times New Roman Regular" w:hAnsi="Times New Roman Regular" w:cs="Times New Roman Regular"/>
+          <w:sz w:val="21"/>
+          <w:szCs w:val="21"/>
+          <w:lang w:eastAsia="zh-CN"/>
+        </w:rPr>
+      </w:pPr>
+      <w:r>
+        <w:rPr>
+          <w:rFonts w:ascii="Times New Roman" w:hAnsi="Times New Roman" w:cs="Times New Roman Regular" w:hint="eastAsia"/>
           <w:sz w:val="21"/>
           <w:szCs w:val="21"/>
           <w:lang w:eastAsia="zh-CN"/>
@@ -356,7 +411,7 @@
       </w:r>
       <w:r>
         <w:rPr>
-          <w:rFonts w:ascii="Times New Roman Regular" w:hAnsi="Times New Roman Regular" w:cs="Times New Roman Regular" w:hint="eastAsia"/>
+          <w:rFonts w:ascii="Times New Roman" w:hAnsi="Times New Roman" w:cs="Times New Roman Regular" w:hint="eastAsia"/>
           <w:sz w:val="21"/>
           <w:szCs w:val="21"/>
           <w:lang w:eastAsia="zh-CN"/>
@@ -366,7 +421,7 @@
       </w:r>
       <w:r>
         <w:rPr>
-          <w:rFonts w:ascii="Times New Roman Regular" w:hAnsi="Times New Roman Regular" w:cs="Times New Roman Regular" w:hint="eastAsia"/>
+          <w:rFonts w:ascii="Times New Roman" w:hAnsi="Times New Roman" w:cs="Times New Roman Regular" w:hint="eastAsia"/>
           <w:sz w:val="21"/>
           <w:szCs w:val="21"/>
           <w:lang w:eastAsia="zh-CN"/>
@@ -376,7 +431,7 @@
       </w:r>
       <w:r>
         <w:rPr>
-          <w:rFonts w:ascii="Times New Roman Regular" w:hAnsi="Times New Roman Regular" w:cs="Times New Roman Regular" w:hint="eastAsia"/>
+          <w:rFonts w:ascii="Times New Roman" w:hAnsi="Times New Roman" w:cs="Times New Roman Regular" w:hint="eastAsia"/>
           <w:sz w:val="21"/>
           <w:szCs w:val="21"/>
           <w:lang w:eastAsia="zh-CN"/>
@@ -386,7 +441,7 @@
       <w:hyperlink r:id="rIdCV10">
         <w:r>
           <w:rPr>
-            <w:rFonts w:ascii="Times New Roman Regular" w:hAnsi="Times New Roman Regular" w:cs="Times New Roman Regular" w:hint="eastAsia"/>
+            <w:rFonts w:ascii="Times New Roman" w:hAnsi="Times New Roman" w:cs="Times New Roman Regular" w:hint="eastAsia"/>
             <w:sz w:val="21"/>
             <w:szCs w:val="21"/>
             <w:lang w:eastAsia="zh-CN"/>
@@ -396,12 +451,277 @@
       </w:hyperlink>
       <w:r>
         <w:rPr>
+          <w:rFonts w:ascii="Times New Roman" w:hAnsi="Times New Roman" w:cs="Times New Roman Regular" w:hint="eastAsia"/>
+          <w:sz w:val="21"/>
+          <w:szCs w:val="21"/>
+          <w:lang w:eastAsia="zh-CN"/>
+        </w:rPr>
+        <w:t xml:space="preserve">", CVPR Workshops (CV4CHL), 2026, pp. 5619-5630.</w:t>
+      </w:r>
+      <w:r>
+        <w:t xml:space="preserve"> </w:t>
+        <w:rPr>
+          <w:rFonts w:ascii="Times New Roman" w:hAnsi="Times New Roman"/>
+          <w:sz w:val="21"/>
+          <w:szCs w:val="21"/>
+        </w:rPr>
+      </w:r>
+      <w:hyperlink r:id="rIdPublication15">
+        <w:r>
+          <w:rPr>
+            <w:u w:val="single"/>
+            <w:rFonts w:ascii="Times New Roman" w:hAnsi="Times New Roman"/>
+            <w:sz w:val="21"/>
+            <w:szCs w:val="21"/>
+          </w:rPr>
+          <w:t>[Paper]</w:t>
+        </w:r>
+      </w:hyperlink>
+    </w:p>
+    <w:p>
+      <w:pPr>
+        <w:widowControl w:val="1"/>
+        <w:numPr>
+          <w:ilvl w:val="0"/>
+          <w:numId w:val="1"/>
+        </w:numPr>
+        <w:autoSpaceDE/>
+        <w:autoSpaceDN/>
+        <w:spacing w:after="20" w:line="240" w:lineRule="auto" w:before="0"/>
+        <w:ind w:hanging="357"/>
+        <w:rPr>
+          <w:rFonts w:ascii="Times New Roman Regular" w:hAnsi="Times New Roman Regular" w:cs="Times New Roman Regular"/>
+          <w:sz w:val="21"/>
+          <w:szCs w:val="21"/>
+          <w:lang w:eastAsia="zh-CN"/>
+        </w:rPr>
+      </w:pPr>
+      <w:r>
+        <w:rPr>
+          <w:rFonts w:ascii="Times New Roman" w:hAnsi="Times New Roman" w:cs="Times New Roman Regular" w:hint="eastAsia"/>
+          <w:sz w:val="21"/>
+          <w:szCs w:val="21"/>
+          <w:lang w:eastAsia="zh-CN"/>
+        </w:rPr>
+        <w:t xml:space="preserve">Bowen Li*, </w:t>
+      </w:r>
+      <w:r>
+        <w:rPr>
+          <w:rFonts w:ascii="Times New Roman" w:hAnsi="Times New Roman" w:cs="Times New Roman Regular" w:hint="eastAsia"/>
+          <w:sz w:val="21"/>
+          <w:szCs w:val="21"/>
+          <w:lang w:eastAsia="zh-CN"/>
+          <w:b/>
+        </w:rPr>
+        <w:t>Zhuoqing Zhong</w:t>
+      </w:r>
+      <w:r>
+        <w:rPr>
+          <w:rFonts w:ascii="Times New Roman" w:hAnsi="Times New Roman" w:cs="Times New Roman Regular" w:hint="eastAsia"/>
+          <w:sz w:val="21"/>
+          <w:szCs w:val="21"/>
+          <w:lang w:eastAsia="zh-CN"/>
+        </w:rPr>
+        <w:t xml:space="preserve">*, et al. "Improving Negative Rejection Ability in Language Models: A Review of Fine-Tuned LLMs, RAG, and RAFT." Journal of King Saud University Computer and Information Sciences, 38(2), 21, 2026.</w:t>
+      </w:r>
+      <w:r>
+        <w:t xml:space="preserve"> </w:t>
+        <w:rPr>
+          <w:rFonts w:ascii="Times New Roman" w:hAnsi="Times New Roman"/>
+          <w:sz w:val="21"/>
+          <w:szCs w:val="21"/>
+        </w:rPr>
+      </w:r>
+      <w:hyperlink r:id="rIdPublication16">
+        <w:r>
+          <w:rPr>
+            <w:u w:val="single"/>
+            <w:rFonts w:ascii="Times New Roman" w:hAnsi="Times New Roman"/>
+            <w:sz w:val="21"/>
+            <w:szCs w:val="21"/>
+          </w:rPr>
+          <w:t>[Paper]</w:t>
+        </w:r>
+      </w:hyperlink>
+    </w:p>
+    <w:p>
+      <w:pPr>
+        <w:widowControl w:val="1"/>
+        <w:numPr>
+          <w:ilvl w:val="0"/>
+          <w:numId w:val="1"/>
+        </w:numPr>
+        <w:autoSpaceDE/>
+        <w:autoSpaceDN/>
+        <w:spacing w:after="20" w:line="240" w:lineRule="auto" w:before="0"/>
+        <w:ind w:hanging="357"/>
+        <w:rPr>
+          <w:rFonts w:ascii="Times New Roman Regular" w:hAnsi="Times New Roman Regular" w:cs="Times New Roman Regular"/>
+          <w:sz w:val="21"/>
+          <w:szCs w:val="21"/>
+          <w:lang w:eastAsia="zh-CN"/>
+        </w:rPr>
+      </w:pPr>
+      <w:r>
+        <w:rPr>
+          <w:rFonts w:ascii="Times New Roman" w:hAnsi="Times New Roman" w:cs="Times New Roman Regular" w:hint="eastAsia"/>
+          <w:sz w:val="21"/>
+          <w:szCs w:val="21"/>
+          <w:lang w:eastAsia="zh-CN"/>
+        </w:rPr>
+        <w:t xml:space="preserve">Ebenezer Fiifi Emire Atta Mills*, Zihui Deng*, </w:t>
+      </w:r>
+      <w:r>
+        <w:rPr>
+          <w:rFonts w:ascii="Times New Roman" w:hAnsi="Times New Roman" w:cs="Times New Roman Regular" w:hint="eastAsia"/>
+          <w:sz w:val="21"/>
+          <w:szCs w:val="21"/>
+          <w:lang w:eastAsia="zh-CN"/>
+          <w:b/>
+        </w:rPr>
+        <w:t>Zhuoqing Zhong</w:t>
+      </w:r>
+      <w:r>
+        <w:rPr>
+          <w:rFonts w:ascii="Times New Roman" w:hAnsi="Times New Roman" w:cs="Times New Roman Regular" w:hint="eastAsia"/>
+          <w:sz w:val="21"/>
+          <w:szCs w:val="21"/>
+          <w:lang w:eastAsia="zh-CN"/>
+        </w:rPr>
+        <w:t xml:space="preserve">*, and Jinger Li. "Data-driven prediction of soccer outcomes using enhanced machine and deep learning techniques." Journal of Big Data, 11, 170, 2024.</w:t>
+      </w:r>
+      <w:r>
+        <w:t xml:space="preserve"> </w:t>
+        <w:rPr>
+          <w:rFonts w:ascii="Times New Roman" w:hAnsi="Times New Roman"/>
+          <w:sz w:val="21"/>
+          <w:szCs w:val="21"/>
+        </w:rPr>
+      </w:r>
+      <w:hyperlink r:id="rIdPublication17">
+        <w:r>
+          <w:rPr>
+            <w:u w:val="single"/>
+            <w:rFonts w:ascii="Times New Roman" w:hAnsi="Times New Roman"/>
+            <w:sz w:val="21"/>
+            <w:szCs w:val="21"/>
+          </w:rPr>
+          <w:t>[Paper]</w:t>
+        </w:r>
+      </w:hyperlink>
+    </w:p>
+    <w:p>
+      <w:pPr>
+        <w:jc w:val="left"/>
+        <w:rPr>
+          <w:rFonts w:ascii="Times New Roman Regular" w:hAnsi="Times New Roman Regular" w:cs="Times New Roman Regular"/>
+          <w:sz w:val="21"/>
+          <w:szCs w:val="21"/>
+          <w:lang w:eastAsia="zh-CN"/>
+        </w:rPr>
+        <w:spacing w:before="0" w:after="20" w:line="240" w:lineRule="auto"/>
+      </w:pPr>
+      <w:r>
+        <w:rPr>
           <w:rFonts w:ascii="Times New Roman Regular" w:hAnsi="Times New Roman Regular" w:cs="Times New Roman Regular" w:hint="eastAsia"/>
           <w:sz w:val="21"/>
           <w:szCs w:val="21"/>
-          <w:lang w:eastAsia="zh-CN"/>
-        </w:rPr>
-        <w:t xml:space="preserve">", CVPR Workshops (CV4CHL), 2026, pp. 5619-5630.</w:t>
+        </w:rPr>
+        <w:t xml:space="preserve">* Equal contribution / shared first authorship.</w:t>
+      </w:r>
+    </w:p>
+    <w:p>
+      <w:pPr>
+        <w:widowControl/>
+        <w:pBdr>
+          <w:bottom w:val="single" w:sz="6" w:space="1" w:color="auto"/>
+        </w:pBdr>
+        <w:autoSpaceDE/>
+        <w:autoSpaceDN/>
+        <w:spacing w:after="20" w:before="90" w:line="240" w:lineRule="auto"/>
+        <w:outlineLvl w:val="0"/>
+        <w:rPr>
+          <w:rFonts w:ascii="Times New Roman Regular" w:hAnsi="Times New Roman Regular" w:cs="Times New Roman Regular"/>
+          <w:b/>
+          <w:bCs/>
+          <w:sz w:val="21"/>
+          <w:szCs w:val="21"/>
+        </w:rPr>
+        <w:keepNext w:val="1"/>
+      </w:pPr>
+      <w:r>
+        <w:rPr>
+          <w:rFonts w:ascii="Times New Roman" w:hAnsi="Times New Roman"/>
+          <w:smallCaps/>
+          <w:sz w:val="21"/>
+          <w:szCs w:val="21"/>
+          <w:lang w:eastAsia="zh-CN"/>
+        </w:rPr>
+        <w:t xml:space="preserve">PROFESSIONAL EXPERIENCE</w:t>
+      </w:r>
+    </w:p>
+    <w:p>
+      <w:pPr>
+        <w:jc w:val="left"/>
+        <w:rPr>
+          <w:rFonts w:ascii="Times New Roman Regular" w:eastAsia="宋体" w:hAnsi="Times New Roman Regular" w:cs="Times New Roman Regular"/>
+          <w:b/>
+          <w:bCs/>
+          <w:sz w:val="21"/>
+          <w:szCs w:val="21"/>
+          <w:lang w:eastAsia="zh-CN"/>
+        </w:rPr>
+        <w:spacing w:before="0" w:after="20" w:line="240" w:lineRule="auto"/>
+      </w:pPr>
+      <w:r>
+        <w:rPr>
+          <w:rFonts w:ascii="Times New Roman Bold" w:hAnsi="Times New Roman Bold" w:cs="Times New Roman Bold"/>
+          <w:bCs/>
+          <w:sz w:val="21"/>
+          <w:szCs w:val="21"/>
+          <w:lang w:eastAsia="zh-CN"/>
+          <w:b w:val="1"/>
+        </w:rPr>
+        <w:t xml:space="preserve">Institute of Software, Chinese Academy of Sciences</w:t>
+      </w:r>
+    </w:p>
+    <w:p>
+      <w:pPr>
+        <w:widowControl/>
+        <w:autoSpaceDE/>
+        <w:autoSpaceDN/>
+        <w:spacing w:after="20" w:line="240" w:lineRule="auto" w:before="0"/>
+        <w:rPr>
+          <w:rFonts w:ascii="Times New Roman Regular" w:hAnsi="Times New Roman Regular" w:cs="Times New Roman Regular"/>
+          <w:sz w:val="21"/>
+          <w:szCs w:val="21"/>
+          <w:lang w:eastAsia="zh-CN"/>
+        </w:rPr>
+        <w:tabs>
+          <w:tab w:val="right" w:pos="10748"/>
+        </w:tabs>
+      </w:pPr>
+      <w:r>
+        <w:rPr>
+          <w:rFonts w:ascii="Times New Roman Regular" w:hAnsi="Times New Roman Regular" w:cs="Times New Roman Regular" w:hint="eastAsia"/>
+          <w:sz w:val="21"/>
+          <w:szCs w:val="21"/>
+          <w:lang w:eastAsia="zh-CN"/>
+          <w:b w:val="0"/>
+        </w:rPr>
+        <w:t xml:space="preserve">Research Intern</w:t>
+      </w:r>
+      <w:r>
+        <w:rPr>
+          <w:rFonts w:ascii="Times New Roman Regular" w:hAnsi="Times New Roman Regular" w:cs="Times New Roman Regular" w:hint="eastAsia"/>
+          <w:sz w:val="21"/>
+          <w:szCs w:val="21"/>
+          <w:lang w:eastAsia="zh-CN"/>
+          <w:b w:val="0"/>
+        </w:rPr>
+        <w:t xml:space="preserve"/>
+        <w:tab/>
+        <w:t xml:space="preserve">Aug 2024 - Sep 2024</w:t>
       </w:r>
     </w:p>
     <w:p>
@@ -413,7 +733,7 @@
         </w:numPr>
         <w:autoSpaceDE/>
         <w:autoSpaceDN/>
-        <w:spacing w:after="20" w:line="212" w:lineRule="auto"/>
+        <w:spacing w:after="20" w:line="240" w:lineRule="auto" w:before="0"/>
         <w:ind w:hanging="357"/>
         <w:rPr>
           <w:rFonts w:ascii="Times New Roman Regular" w:hAnsi="Times New Roman Regular" w:cs="Times New Roman Regular"/>
@@ -424,62 +744,12 @@
       </w:pPr>
       <w:r>
         <w:rPr>
-          <w:rFonts w:ascii="Times New Roman Regular" w:hAnsi="Times New Roman Regular" w:cs="Times New Roman Regular" w:hint="eastAsia"/>
-          <w:sz w:val="21"/>
-          <w:szCs w:val="21"/>
-          <w:lang w:eastAsia="zh-CN"/>
-          <w:b w:val="0"/>
-        </w:rPr>
-        <w:t xml:space="preserve">Bowen Li*, </w:t>
-      </w:r>
-      <w:r>
-        <w:rPr>
-          <w:rFonts w:ascii="Times New Roman Regular" w:hAnsi="Times New Roman Regular" w:cs="Times New Roman Regular" w:hint="eastAsia"/>
-          <w:sz w:val="21"/>
-          <w:szCs w:val="21"/>
-          <w:lang w:eastAsia="zh-CN"/>
-          <w:b w:val="1"/>
-        </w:rPr>
-        <w:t xml:space="preserve">Zhuoqing Zhong</w:t>
-      </w:r>
-      <w:r>
-        <w:rPr>
-          <w:rFonts w:ascii="Times New Roman Regular" w:hAnsi="Times New Roman Regular" w:cs="Times New Roman Regular" w:hint="eastAsia"/>
-          <w:sz w:val="21"/>
-          <w:szCs w:val="21"/>
-          <w:lang w:eastAsia="zh-CN"/>
-          <w:b w:val="0"/>
-        </w:rPr>
-        <w:t xml:space="preserve">*, et al.</w:t>
-      </w:r>
-      <w:r>
-        <w:rPr>
-          <w:rFonts w:ascii="Times New Roman Regular" w:hAnsi="Times New Roman Regular" w:cs="Times New Roman Regular" w:hint="eastAsia"/>
-          <w:sz w:val="21"/>
-          <w:szCs w:val="21"/>
-          <w:lang w:eastAsia="zh-CN"/>
-        </w:rPr>
-        <w:t xml:space="preserve"> "</w:t>
-      </w:r>
-      <w:hyperlink r:id="rIdCV11">
-        <w:r>
-          <w:rPr>
-            <w:rFonts w:ascii="Times New Roman Regular" w:hAnsi="Times New Roman Regular" w:cs="Times New Roman Regular" w:hint="eastAsia"/>
-            <w:sz w:val="21"/>
-            <w:szCs w:val="21"/>
-            <w:lang w:eastAsia="zh-CN"/>
-          </w:rPr>
-          <w:t xml:space="preserve">Improving Negative Rejection Ability in Language Models: A Review of Fine-Tuned LLMs, RAG, and RAFT</w:t>
-        </w:r>
-      </w:hyperlink>
-      <w:r>
-        <w:rPr>
-          <w:rFonts w:ascii="Times New Roman Regular" w:hAnsi="Times New Roman Regular" w:cs="Times New Roman Regular" w:hint="eastAsia"/>
-          <w:sz w:val="21"/>
-          <w:szCs w:val="21"/>
-          <w:lang w:eastAsia="zh-CN"/>
-        </w:rPr>
-        <w:t xml:space="preserve">", Journal of King Saud University Computer and Information Sciences, 38, 21, 2026.</w:t>
+          <w:rFonts w:ascii="Times New Roman Regular" w:hAnsi="Times New Roman Regular" w:cs="Times New Roman Regular"/>
+          <w:sz w:val="21"/>
+          <w:szCs w:val="21"/>
+          <w:lang w:eastAsia="zh-CN"/>
+        </w:rPr>
+        <w:t>Implemented a data pipeline and token-level explanations for language models using Layer-wise Relevance Propagation (LRP) and DeepLIFT.</w:t>
       </w:r>
     </w:p>
     <w:p>
@@ -491,7 +761,7 @@
         </w:numPr>
         <w:autoSpaceDE/>
         <w:autoSpaceDN/>
-        <w:spacing w:after="20" w:line="212" w:lineRule="auto"/>
+        <w:spacing w:after="20" w:line="240" w:lineRule="auto" w:before="0"/>
         <w:ind w:hanging="357"/>
         <w:rPr>
           <w:rFonts w:ascii="Times New Roman Regular" w:hAnsi="Times New Roman Regular" w:cs="Times New Roman Regular"/>
@@ -502,62 +772,85 @@
       </w:pPr>
       <w:r>
         <w:rPr>
+          <w:rFonts w:ascii="Times New Roman Regular" w:hAnsi="Times New Roman Regular" w:cs="Times New Roman Regular"/>
+          <w:sz w:val="21"/>
+          <w:szCs w:val="21"/>
+          <w:lang w:eastAsia="zh-CN"/>
+        </w:rPr>
+        <w:t>Compared attribution methods on general and medical text examples through token-relevance visualizations.</w:t>
+      </w:r>
+    </w:p>
+    <w:p>
+      <w:pPr>
+        <w:widowControl/>
+        <w:pBdr>
+          <w:bottom w:val="single" w:sz="6" w:space="1" w:color="auto"/>
+        </w:pBdr>
+        <w:autoSpaceDE/>
+        <w:autoSpaceDN/>
+        <w:spacing w:after="20" w:before="90" w:line="240" w:lineRule="auto"/>
+        <w:outlineLvl w:val="0"/>
+        <w:rPr>
+          <w:rFonts w:ascii="Times New Roman Regular" w:hAnsi="Times New Roman Regular" w:cs="Times New Roman Regular"/>
+          <w:b/>
+          <w:bCs/>
+          <w:sz w:val="21"/>
+          <w:szCs w:val="21"/>
+        </w:rPr>
+        <w:keepNext w:val="1"/>
+      </w:pPr>
+      <w:r>
+        <w:rPr>
+          <w:rFonts w:ascii="Times New Roman" w:hAnsi="Times New Roman"/>
+          <w:smallCaps/>
+          <w:sz w:val="21"/>
+          <w:szCs w:val="21"/>
+          <w:lang w:eastAsia="zh-CN"/>
+        </w:rPr>
+        <w:t xml:space="preserve">RESEARCH EXPERIENCE</w:t>
+      </w:r>
+    </w:p>
+    <w:p>
+      <w:pPr>
+        <w:widowControl/>
+        <w:autoSpaceDE/>
+        <w:autoSpaceDN/>
+        <w:spacing w:after="20" w:line="240" w:lineRule="auto" w:before="45"/>
+        <w:rPr>
+          <w:rFonts w:ascii="Times New Roman Bold" w:hAnsi="Times New Roman Bold" w:cs="Times New Roman Bold"/>
+          <w:b/>
+          <w:bCs/>
+          <w:sz w:val="21"/>
+          <w:szCs w:val="21"/>
+          <w:lang w:eastAsia="zh-CN"/>
+        </w:rPr>
+        <w:tabs>
+          <w:tab w:val="right" w:pos="10748"/>
+        </w:tabs>
+        <w:keepNext/>
+      </w:pPr>
+      <w:r>
+        <w:rPr>
+          <w:rFonts w:ascii="Times New Roman Bold" w:hAnsi="Times New Roman Bold" w:cs="Times New Roman Bold"/>
+          <w:bCs/>
+          <w:sz w:val="21"/>
+          <w:szCs w:val="21"/>
+          <w:lang w:eastAsia="zh-CN"/>
+          <w:b w:val="1"/>
+        </w:rPr>
+        <w:t>Developmental Learning for Multimodal Models</w:t>
+      </w:r>
+      <w:r>
+        <w:rPr>
           <w:rFonts w:ascii="Times New Roman Regular" w:hAnsi="Times New Roman Regular" w:cs="Times New Roman Regular" w:hint="eastAsia"/>
           <w:sz w:val="21"/>
           <w:szCs w:val="21"/>
           <w:lang w:eastAsia="zh-CN"/>
           <w:b w:val="0"/>
         </w:rPr>
-        <w:t xml:space="preserve">Ebenezer Fiifi Emire Atta Mills*, Zihui Deng*, </w:t>
-      </w:r>
-      <w:r>
-        <w:rPr>
-          <w:rFonts w:ascii="Times New Roman Regular" w:hAnsi="Times New Roman Regular" w:cs="Times New Roman Regular" w:hint="eastAsia"/>
-          <w:sz w:val="21"/>
-          <w:szCs w:val="21"/>
-          <w:lang w:eastAsia="zh-CN"/>
-          <w:b w:val="1"/>
-        </w:rPr>
-        <w:t xml:space="preserve">Zhuoqing Zhong</w:t>
-      </w:r>
-      <w:r>
-        <w:rPr>
-          <w:rFonts w:ascii="Times New Roman Regular" w:hAnsi="Times New Roman Regular" w:cs="Times New Roman Regular" w:hint="eastAsia"/>
-          <w:sz w:val="21"/>
-          <w:szCs w:val="21"/>
-          <w:lang w:eastAsia="zh-CN"/>
-          <w:b w:val="0"/>
-        </w:rPr>
-        <w:t xml:space="preserve">*, Jinger Li.</w:t>
-      </w:r>
-      <w:r>
-        <w:rPr>
-          <w:rFonts w:ascii="Times New Roman Regular" w:hAnsi="Times New Roman Regular" w:cs="Times New Roman Regular" w:hint="eastAsia"/>
-          <w:sz w:val="21"/>
-          <w:szCs w:val="21"/>
-          <w:lang w:eastAsia="zh-CN"/>
-        </w:rPr>
-        <w:t xml:space="preserve"> "</w:t>
-      </w:r>
-      <w:hyperlink r:id="rIdCV12">
-        <w:r>
-          <w:rPr>
-            <w:rFonts w:ascii="Times New Roman Regular" w:hAnsi="Times New Roman Regular" w:cs="Times New Roman Regular" w:hint="eastAsia"/>
-            <w:sz w:val="21"/>
-            <w:szCs w:val="21"/>
-            <w:lang w:eastAsia="zh-CN"/>
-          </w:rPr>
-          <w:t xml:space="preserve">Data-driven prediction of soccer outcomes using enhanced machine and deep learning techniques</w:t>
-        </w:r>
-      </w:hyperlink>
-      <w:r>
-        <w:rPr>
-          <w:rFonts w:ascii="Times New Roman Regular" w:hAnsi="Times New Roman Regular" w:cs="Times New Roman Regular" w:hint="eastAsia"/>
-          <w:sz w:val="21"/>
-          <w:szCs w:val="21"/>
-          <w:lang w:eastAsia="zh-CN"/>
-        </w:rPr>
-        <w:t xml:space="preserve">", Journal of Big Data, 2024.</w:t>
+        <w:t xml:space="preserve"/>
+        <w:tab/>
+        <w:t xml:space="preserve">Nov 2025 - Mar 2026</w:t>
       </w:r>
     </w:p>
     <w:p>
@@ -569,7 +862,7 @@
         </w:numPr>
         <w:autoSpaceDE/>
         <w:autoSpaceDN/>
-        <w:spacing w:after="20" w:line="212" w:lineRule="auto"/>
+        <w:spacing w:after="20" w:line="240" w:lineRule="auto" w:before="0"/>
         <w:ind w:hanging="357"/>
         <w:rPr>
           <w:rFonts w:ascii="Times New Roman Regular" w:hAnsi="Times New Roman Regular" w:cs="Times New Roman Regular"/>
@@ -580,124 +873,32 @@
       </w:pPr>
       <w:r>
         <w:rPr>
-          <w:rFonts w:ascii="Times New Roman Regular" w:hAnsi="Times New Roman Regular" w:cs="Times New Roman Regular" w:hint="eastAsia"/>
-          <w:sz w:val="21"/>
-          <w:szCs w:val="21"/>
-          <w:lang w:eastAsia="zh-CN"/>
-          <w:b w:val="0"/>
-        </w:rPr>
-        <w:t xml:space="preserve">Baha Ihnaini, Wei Liu, </w:t>
-      </w:r>
-      <w:r>
-        <w:rPr>
-          <w:rFonts w:ascii="Times New Roman Regular" w:hAnsi="Times New Roman Regular" w:cs="Times New Roman Regular" w:hint="eastAsia"/>
-          <w:sz w:val="21"/>
-          <w:szCs w:val="21"/>
-          <w:lang w:eastAsia="zh-CN"/>
-          <w:b w:val="1"/>
-        </w:rPr>
-        <w:t xml:space="preserve">Zhuoqing Zhong</w:t>
-      </w:r>
-      <w:r>
-        <w:rPr>
-          <w:rFonts w:ascii="Times New Roman Regular" w:hAnsi="Times New Roman Regular" w:cs="Times New Roman Regular" w:hint="eastAsia"/>
-          <w:sz w:val="21"/>
-          <w:szCs w:val="21"/>
-          <w:lang w:eastAsia="zh-CN"/>
-          <w:b w:val="0"/>
-        </w:rPr>
-        <w:t xml:space="preserve"> (co-first author), et al.</w:t>
-      </w:r>
-      <w:r>
-        <w:rPr>
-          <w:rFonts w:ascii="Times New Roman Regular" w:hAnsi="Times New Roman Regular" w:cs="Times New Roman Regular" w:hint="eastAsia"/>
-          <w:sz w:val="21"/>
-          <w:szCs w:val="21"/>
-          <w:lang w:eastAsia="zh-CN"/>
-        </w:rPr>
-        <w:t xml:space="preserve"> "</w:t>
-      </w:r>
-      <w:r>
-        <w:rPr>
-          <w:rFonts w:ascii="Times New Roman Regular" w:hAnsi="Times New Roman Regular" w:cs="Times New Roman Regular" w:hint="eastAsia"/>
-          <w:sz w:val="21"/>
-          <w:szCs w:val="21"/>
-          <w:lang w:eastAsia="zh-CN"/>
-        </w:rPr>
-        <w:t xml:space="preserve">Evaluating Mild Cognitive Impairment Using Large Language Models: A Comparative Analysis</w:t>
-      </w:r>
-      <w:r>
-        <w:rPr>
-          <w:rFonts w:ascii="Times New Roman Regular" w:hAnsi="Times New Roman Regular" w:cs="Times New Roman Regular" w:hint="eastAsia"/>
-          <w:sz w:val="21"/>
-          <w:szCs w:val="21"/>
-          <w:lang w:eastAsia="zh-CN"/>
-        </w:rPr>
-        <w:t xml:space="preserve">", Submitted to Acta Pharmacologica Sinica.</w:t>
-      </w:r>
-    </w:p>
-    <w:p>
-      <w:pPr>
-        <w:jc w:val="left"/>
-        <w:rPr>
-          <w:rFonts w:ascii="Times New Roman Regular" w:hAnsi="Times New Roman Regular" w:cs="Times New Roman Regular"/>
-          <w:sz w:val="21"/>
-          <w:szCs w:val="21"/>
-          <w:lang w:eastAsia="zh-CN"/>
-        </w:rPr>
-        <w:spacing/>
-      </w:pPr>
-      <w:r>
-        <w:rPr>
-          <w:rFonts w:ascii="Times New Roman Regular" w:hAnsi="Times New Roman Regular" w:cs="Times New Roman Regular" w:hint="eastAsia"/>
-          <w:sz w:val="21"/>
-          <w:szCs w:val="21"/>
-        </w:rPr>
-        <w:t xml:space="preserve">* Equal contribution / shared first authorship.</w:t>
+          <w:rFonts w:ascii="Times New Roman Regular" w:hAnsi="Times New Roman Regular" w:cs="Times New Roman Regular"/>
+          <w:sz w:val="21"/>
+          <w:szCs w:val="21"/>
+          <w:lang w:eastAsia="zh-CN"/>
+        </w:rPr>
+        <w:t xml:space="preserve">Surveyed developmental learning for multimodal models; contributed to a framework for grounding, supervision inference, memory, and continual adaptation.</w:t>
       </w:r>
     </w:p>
     <w:p>
       <w:pPr>
         <w:widowControl/>
-        <w:pBdr>
-          <w:bottom w:val="single" w:sz="6" w:space="1" w:color="auto"/>
-        </w:pBdr>
-        <w:autoSpaceDE/>
-        <w:autoSpaceDN/>
-        <w:spacing w:after="50" w:before="60"/>
-        <w:outlineLvl w:val="0"/>
-        <w:rPr>
-          <w:rFonts w:ascii="Times New Roman Regular" w:hAnsi="Times New Roman Regular" w:cs="Times New Roman Regular"/>
+        <w:autoSpaceDE/>
+        <w:autoSpaceDN/>
+        <w:spacing w:after="20" w:line="240" w:lineRule="auto" w:before="45"/>
+        <w:rPr>
+          <w:rFonts w:ascii="Times New Roman Bold" w:hAnsi="Times New Roman Bold" w:cs="Times New Roman Bold"/>
           <w:b/>
           <w:bCs/>
           <w:sz w:val="21"/>
           <w:szCs w:val="21"/>
-        </w:rPr>
+          <w:lang w:eastAsia="zh-CN"/>
+        </w:rPr>
+        <w:tabs>
+          <w:tab w:val="right" w:pos="10748"/>
+        </w:tabs>
         <w:keepNext/>
-      </w:pPr>
-      <w:r>
-        <w:rPr>
-          <w:rFonts w:ascii="Times New Roman" w:hAnsi="Times New Roman"/>
-          <w:smallCaps/>
-          <w:sz w:val="21"/>
-          <w:szCs w:val="21"/>
-          <w:lang w:eastAsia="zh-CN"/>
-        </w:rPr>
-        <w:t xml:space="preserve">PROFESSIONAL EXPERIENCE</w:t>
-      </w:r>
-    </w:p>
-    <w:p>
-      <w:pPr>
-        <w:jc w:val="left"/>
-        <w:rPr>
-          <w:rFonts w:ascii="Times New Roman Regular" w:eastAsia="宋体" w:hAnsi="Times New Roman Regular" w:cs="Times New Roman Regular"/>
-          <w:b/>
-          <w:bCs/>
-          <w:sz w:val="21"/>
-          <w:szCs w:val="21"/>
-          <w:lang w:eastAsia="zh-CN"/>
-        </w:rPr>
-        <w:spacing/>
       </w:pPr>
       <w:r>
         <w:rPr>
@@ -708,34 +909,7 @@
           <w:lang w:eastAsia="zh-CN"/>
           <w:b w:val="1"/>
         </w:rPr>
-        <w:t xml:space="preserve">Institute of Software, Chinese Academy of Sciences</w:t>
-      </w:r>
-    </w:p>
-    <w:p>
-      <w:pPr>
-        <w:widowControl/>
-        <w:autoSpaceDE/>
-        <w:autoSpaceDN/>
-        <w:spacing w:after="10" w:line="212" w:lineRule="auto"/>
-        <w:rPr>
-          <w:rFonts w:ascii="Times New Roman Regular" w:hAnsi="Times New Roman Regular" w:cs="Times New Roman Regular"/>
-          <w:sz w:val="21"/>
-          <w:szCs w:val="21"/>
-          <w:lang w:eastAsia="zh-CN"/>
-        </w:rPr>
-        <w:tabs>
-          <w:tab w:val="right" w:pos="10880"/>
-        </w:tabs>
-      </w:pPr>
-      <w:r>
-        <w:rPr>
-          <w:rFonts w:ascii="Times New Roman Regular" w:hAnsi="Times New Roman Regular" w:cs="Times New Roman Regular" w:hint="eastAsia"/>
-          <w:sz w:val="21"/>
-          <w:szCs w:val="21"/>
-          <w:lang w:eastAsia="zh-CN"/>
-          <w:b w:val="0"/>
-        </w:rPr>
-        <w:t xml:space="preserve">Research Intern</w:t>
+        <w:t>LLM Reliability and Rejection Behavior</w:t>
       </w:r>
       <w:r>
         <w:rPr>
@@ -747,7 +921,7 @@
         </w:rPr>
         <w:t xml:space="preserve"/>
         <w:tab/>
-        <w:t xml:space="preserve">Aug 2024 - Sep 2024</w:t>
+        <w:t xml:space="preserve">Nov 2024 - May 2025</w:t>
       </w:r>
     </w:p>
     <w:p>
@@ -759,7 +933,7 @@
         </w:numPr>
         <w:autoSpaceDE/>
         <w:autoSpaceDN/>
-        <w:spacing w:after="20" w:line="212" w:lineRule="auto"/>
+        <w:spacing w:after="20" w:line="240" w:lineRule="auto" w:before="0"/>
         <w:ind w:hanging="357"/>
         <w:rPr>
           <w:rFonts w:ascii="Times New Roman Regular" w:hAnsi="Times New Roman Regular" w:cs="Times New Roman Regular"/>
@@ -775,7 +949,50 @@
           <w:szCs w:val="21"/>
           <w:lang w:eastAsia="zh-CN"/>
         </w:rPr>
-        <w:t>Implemented a data pipeline and token-level explanations for language models using Layer-wise Relevance Propagation (LRP) and DeepLIFT.</w:t>
+        <w:t xml:space="preserve">Reviewed fine-tuning, RAG, and RAFT across five scholarly databases; compared rejection behavior, hallucination mitigation, cost, and domain adaptability.</w:t>
+      </w:r>
+    </w:p>
+    <w:p>
+      <w:pPr>
+        <w:widowControl/>
+        <w:autoSpaceDE/>
+        <w:autoSpaceDN/>
+        <w:spacing w:after="20" w:line="240" w:lineRule="auto" w:before="45"/>
+        <w:rPr>
+          <w:rFonts w:ascii="Times New Roman Bold" w:hAnsi="Times New Roman Bold" w:cs="Times New Roman Bold"/>
+          <w:b/>
+          <w:bCs/>
+          <w:sz w:val="21"/>
+          <w:szCs w:val="21"/>
+          <w:lang w:eastAsia="zh-CN"/>
+        </w:rPr>
+        <w:tabs>
+          <w:tab w:val="right" w:pos="10748"/>
+        </w:tabs>
+        <w:keepNext/>
+      </w:pPr>
+      <w:r>
+        <w:rPr>
+          <w:rFonts w:ascii="Times New Roman Bold" w:hAnsi="Times New Roman Bold" w:cs="Times New Roman Bold"/>
+          <w:bCs/>
+          <w:sz w:val="21"/>
+          <w:szCs w:val="21"/>
+          <w:lang w:eastAsia="zh-CN"/>
+          <w:b w:val="1"/>
+        </w:rPr>
+        <w:t>Language Models for Cognitive Screening</w:t>
+      </w:r>
+      <w:r>
+        <w:rPr>
+          <w:rFonts w:ascii="Times New Roman Regular" w:hAnsi="Times New Roman Regular" w:cs="Times New Roman Regular" w:hint="eastAsia"/>
+          <w:sz w:val="21"/>
+          <w:szCs w:val="21"/>
+          <w:lang w:eastAsia="zh-CN"/>
+          <w:b w:val="0"/>
+        </w:rPr>
+        <w:t xml:space="preserve"/>
+        <w:tab/>
+        <w:t xml:space="preserve">Feb 2024 - Jul 2025</w:t>
       </w:r>
     </w:p>
     <w:p>
@@ -787,7 +1004,7 @@
         </w:numPr>
         <w:autoSpaceDE/>
         <w:autoSpaceDN/>
-        <w:spacing w:after="20" w:line="212" w:lineRule="auto"/>
+        <w:spacing w:after="20" w:line="240" w:lineRule="auto" w:before="0"/>
         <w:ind w:hanging="357"/>
         <w:rPr>
           <w:rFonts w:ascii="Times New Roman Regular" w:hAnsi="Times New Roman Regular" w:cs="Times New Roman Regular"/>
@@ -803,80 +1020,7 @@
           <w:szCs w:val="21"/>
           <w:lang w:eastAsia="zh-CN"/>
         </w:rPr>
-        <w:t>Compared attribution methods on general and medical text examples through token-relevance visualizations.</w:t>
-      </w:r>
-    </w:p>
-    <w:p>
-      <w:pPr>
-        <w:widowControl/>
-        <w:pBdr>
-          <w:bottom w:val="single" w:sz="6" w:space="1" w:color="auto"/>
-        </w:pBdr>
-        <w:autoSpaceDE/>
-        <w:autoSpaceDN/>
-        <w:spacing w:after="50" w:before="60"/>
-        <w:outlineLvl w:val="0"/>
-        <w:rPr>
-          <w:rFonts w:ascii="Times New Roman Regular" w:hAnsi="Times New Roman Regular" w:cs="Times New Roman Regular"/>
-          <w:b/>
-          <w:bCs/>
-          <w:sz w:val="21"/>
-          <w:szCs w:val="21"/>
-        </w:rPr>
-        <w:keepNext/>
-      </w:pPr>
-      <w:r>
-        <w:rPr>
-          <w:rFonts w:ascii="Times New Roman" w:hAnsi="Times New Roman"/>
-          <w:smallCaps/>
-          <w:sz w:val="21"/>
-          <w:szCs w:val="21"/>
-          <w:lang w:eastAsia="zh-CN"/>
-        </w:rPr>
-        <w:t xml:space="preserve">RESEARCH EXPERIENCE</w:t>
-      </w:r>
-    </w:p>
-    <w:p>
-      <w:pPr>
-        <w:widowControl/>
-        <w:autoSpaceDE/>
-        <w:autoSpaceDN/>
-        <w:spacing w:after="20" w:line="212" w:lineRule="auto" w:before="20"/>
-        <w:rPr>
-          <w:rFonts w:ascii="Times New Roman Bold" w:hAnsi="Times New Roman Bold" w:cs="Times New Roman Bold"/>
-          <w:b/>
-          <w:bCs/>
-          <w:sz w:val="21"/>
-          <w:szCs w:val="21"/>
-          <w:lang w:eastAsia="zh-CN"/>
-        </w:rPr>
-        <w:tabs>
-          <w:tab w:val="right" w:pos="10880"/>
-        </w:tabs>
-        <w:keepNext/>
-      </w:pPr>
-      <w:r>
-        <w:rPr>
-          <w:rFonts w:ascii="Times New Roman Bold" w:hAnsi="Times New Roman Bold" w:cs="Times New Roman Bold"/>
-          <w:bCs/>
-          <w:sz w:val="21"/>
-          <w:szCs w:val="21"/>
-          <w:lang w:eastAsia="zh-CN"/>
-          <w:b w:val="1"/>
-        </w:rPr>
-        <w:t>Developmental Learning for Multimodal Models</w:t>
-      </w:r>
-      <w:r>
-        <w:rPr>
-          <w:rFonts w:ascii="Times New Roman Regular" w:hAnsi="Times New Roman Regular" w:cs="Times New Roman Regular" w:hint="eastAsia"/>
-          <w:sz w:val="21"/>
-          <w:szCs w:val="21"/>
-          <w:lang w:eastAsia="zh-CN"/>
-          <w:b w:val="0"/>
-        </w:rPr>
-        <w:t xml:space="preserve"/>
-        <w:tab/>
-        <w:t xml:space="preserve">Nov 2025 - Mar 2026</w:t>
+        <w:t xml:space="preserve">Built a Chinese speech-to-text pipeline for cognitive screening, including audio normalization and transcript correction.</w:t>
       </w:r>
     </w:p>
     <w:p>
@@ -888,7 +1032,7 @@
         </w:numPr>
         <w:autoSpaceDE/>
         <w:autoSpaceDN/>
-        <w:spacing w:after="20" w:line="212" w:lineRule="auto"/>
+        <w:spacing w:after="20" w:line="240" w:lineRule="auto" w:before="0"/>
         <w:ind w:hanging="357"/>
         <w:rPr>
           <w:rFonts w:ascii="Times New Roman Regular" w:hAnsi="Times New Roman Regular" w:cs="Times New Roman Regular"/>
@@ -904,7 +1048,7 @@
           <w:szCs w:val="21"/>
           <w:lang w:eastAsia="zh-CN"/>
         </w:rPr>
-        <w:t xml:space="preserve">Surveyed developmental learning for multimodal models, focusing on grounding, supervision inference, memory, and continual adaptation.</w:t>
+        <w:t xml:space="preserve">Compared prompting, fine-tuning, and LoRA across Llama-3, Gemma, and Qwen under different quantization settings.</w:t>
       </w:r>
     </w:p>
     <w:p>
@@ -916,7 +1060,7 @@
         </w:numPr>
         <w:autoSpaceDE/>
         <w:autoSpaceDN/>
-        <w:spacing w:after="20" w:line="212" w:lineRule="auto"/>
+        <w:spacing w:after="20" w:line="240" w:lineRule="auto" w:before="0"/>
         <w:ind w:hanging="357"/>
         <w:rPr>
           <w:rFonts w:ascii="Times New Roman Regular" w:hAnsi="Times New Roman Regular" w:cs="Times New Roman Regular"/>
@@ -932,77 +1076,35 @@
           <w:szCs w:val="21"/>
           <w:lang w:eastAsia="zh-CN"/>
         </w:rPr>
-        <w:t xml:space="preserve">Contributed to a framework spanning task formation, supervision inference, and continuous growth; analyzed limitations in sequential multimodal data and evaluation benchmarks.</w:t>
+        <w:t xml:space="preserve">Evaluated with subject-level five-fold cross-validation; the study achieved approximately 0.86 accuracy and F1 with 4-bit QLoRA.</w:t>
       </w:r>
     </w:p>
     <w:p>
       <w:pPr>
         <w:widowControl/>
-        <w:autoSpaceDE/>
-        <w:autoSpaceDN/>
-        <w:spacing w:after="20" w:line="212" w:lineRule="auto" w:before="60"/>
-        <w:rPr>
-          <w:rFonts w:ascii="Times New Roman Bold" w:hAnsi="Times New Roman Bold" w:cs="Times New Roman Bold"/>
-          <w:b/>
-          <w:bCs/>
-          <w:sz w:val="21"/>
-          <w:szCs w:val="21"/>
-          <w:lang w:eastAsia="zh-CN"/>
-        </w:rPr>
-        <w:tabs>
-          <w:tab w:val="right" w:pos="10880"/>
-        </w:tabs>
-        <w:keepNext/>
-      </w:pPr>
-      <w:r>
-        <w:rPr>
-          <w:rFonts w:ascii="Times New Roman Bold" w:hAnsi="Times New Roman Bold" w:cs="Times New Roman Bold"/>
-          <w:bCs/>
-          <w:sz w:val="21"/>
-          <w:szCs w:val="21"/>
-          <w:lang w:eastAsia="zh-CN"/>
-          <w:b w:val="1"/>
-        </w:rPr>
-        <w:t>LLM Reliability and Rejection Behavior</w:t>
-      </w:r>
-      <w:r>
-        <w:rPr>
-          <w:rFonts w:ascii="Times New Roman Regular" w:hAnsi="Times New Roman Regular" w:cs="Times New Roman Regular" w:hint="eastAsia"/>
-          <w:sz w:val="21"/>
-          <w:szCs w:val="21"/>
-          <w:lang w:eastAsia="zh-CN"/>
-          <w:b w:val="0"/>
-        </w:rPr>
-        <w:t xml:space="preserve"/>
-        <w:tab/>
-        <w:t xml:space="preserve">Nov 2024 - May 2025</w:t>
-      </w:r>
-    </w:p>
-    <w:p>
-      <w:pPr>
-        <w:widowControl/>
-        <w:autoSpaceDE/>
-        <w:autoSpaceDN/>
-        <w:spacing w:after="10" w:line="212" w:lineRule="auto"/>
-        <w:rPr>
-          <w:rFonts w:ascii="Times New Roman Regular" w:hAnsi="Times New Roman Regular" w:cs="Times New Roman Regular"/>
-          <w:sz w:val="21"/>
-          <w:szCs w:val="21"/>
-          <w:lang w:eastAsia="zh-CN"/>
-        </w:rPr>
-        <w:tabs>
-          <w:tab w:val="right" w:pos="10880"/>
-        </w:tabs>
-      </w:pPr>
-      <w:r>
-        <w:rPr>
-          <w:rFonts w:ascii="Times New Roman Regular" w:hAnsi="Times New Roman Regular" w:cs="Times New Roman Regular" w:hint="eastAsia"/>
-          <w:sz w:val="21"/>
-          <w:szCs w:val="21"/>
-          <w:lang w:eastAsia="zh-CN"/>
-          <w:b w:val="0"/>
-        </w:rPr>
-        <w:t xml:space="preserve">Co-first author | Advisor: Dr. Baha Ihnaini</w:t>
+        <w:pBdr>
+          <w:bottom w:val="single" w:sz="6" w:space="1" w:color="auto"/>
+        </w:pBdr>
+        <w:autoSpaceDE/>
+        <w:autoSpaceDN/>
+        <w:spacing w:after="20" w:before="90" w:line="240" w:lineRule="auto"/>
+        <w:outlineLvl w:val="0"/>
+        <w:rPr>
+          <w:rFonts w:ascii="Times New Roman Regular" w:hAnsi="Times New Roman Regular" w:cs="Times New Roman Regular"/>
+          <w:sz w:val="21"/>
+          <w:szCs w:val="21"/>
+        </w:rPr>
+        <w:keepNext w:val="1"/>
+      </w:pPr>
+      <w:r>
+        <w:rPr>
+          <w:rFonts w:ascii="Times New Roman" w:hAnsi="Times New Roman"/>
+          <w:smallCaps/>
+          <w:sz w:val="21"/>
+          <w:szCs w:val="21"/>
+          <w:lang w:eastAsia="zh-CN"/>
+        </w:rPr>
+        <w:t xml:space="preserve">RESEARCH INTERESTS</w:t>
       </w:r>
     </w:p>
     <w:p>
@@ -1014,7 +1116,7 @@
         </w:numPr>
         <w:autoSpaceDE/>
         <w:autoSpaceDN/>
-        <w:spacing w:after="20" w:line="212" w:lineRule="auto"/>
+        <w:spacing w:after="20" w:line="240" w:lineRule="auto" w:before="0"/>
         <w:ind w:hanging="357"/>
         <w:rPr>
           <w:rFonts w:ascii="Times New Roman Regular" w:hAnsi="Times New Roman Regular" w:cs="Times New Roman Regular"/>
@@ -1030,540 +1132,12 @@
           <w:szCs w:val="21"/>
           <w:lang w:eastAsia="zh-CN"/>
         </w:rPr>
-        <w:t xml:space="preserve">Conducted a literature review across five scholarly databases, applying inclusion criteria, citation tracing, and structured extraction of models, datasets, and metrics.</w:t>
-      </w:r>
-    </w:p>
-    <w:p>
-      <w:pPr>
-        <w:widowControl/>
-        <w:numPr>
-          <w:ilvl w:val="0"/>
-          <w:numId w:val="1"/>
-        </w:numPr>
-        <w:autoSpaceDE/>
-        <w:autoSpaceDN/>
-        <w:spacing w:after="20" w:line="212" w:lineRule="auto"/>
-        <w:ind w:hanging="357"/>
-        <w:rPr>
-          <w:rFonts w:ascii="Times New Roman Regular" w:hAnsi="Times New Roman Regular" w:cs="Times New Roman Regular"/>
-          <w:sz w:val="21"/>
-          <w:szCs w:val="21"/>
-          <w:lang w:eastAsia="zh-CN"/>
-        </w:rPr>
-      </w:pPr>
-      <w:r>
-        <w:rPr>
-          <w:rFonts w:ascii="Times New Roman Regular" w:hAnsi="Times New Roman Regular" w:cs="Times New Roman Regular"/>
-          <w:sz w:val="21"/>
-          <w:szCs w:val="21"/>
-          <w:lang w:eastAsia="zh-CN"/>
-        </w:rPr>
-        <w:t xml:space="preserve">Compared fine-tuning, RAG, and RAFT for rejection behavior, hallucination mitigation, computational cost, and domain adaptability; co-developed a four-dimensional review framework.</w:t>
-      </w:r>
-    </w:p>
-    <w:p>
-      <w:pPr>
-        <w:widowControl/>
-        <w:autoSpaceDE/>
-        <w:autoSpaceDN/>
-        <w:spacing w:after="20" w:line="212" w:lineRule="auto" w:before="60"/>
-        <w:rPr>
-          <w:rFonts w:ascii="Times New Roman Bold" w:hAnsi="Times New Roman Bold" w:cs="Times New Roman Bold"/>
-          <w:b/>
-          <w:bCs/>
-          <w:sz w:val="21"/>
-          <w:szCs w:val="21"/>
-          <w:lang w:eastAsia="zh-CN"/>
-        </w:rPr>
-        <w:tabs>
-          <w:tab w:val="right" w:pos="10880"/>
-        </w:tabs>
-        <w:keepNext/>
-      </w:pPr>
-      <w:r>
-        <w:rPr>
-          <w:rFonts w:ascii="Times New Roman Bold" w:hAnsi="Times New Roman Bold" w:cs="Times New Roman Bold"/>
-          <w:bCs/>
-          <w:sz w:val="21"/>
-          <w:szCs w:val="21"/>
-          <w:lang w:eastAsia="zh-CN"/>
-          <w:b w:val="1"/>
-        </w:rPr>
-        <w:t>Language Models for Cognitive Screening</w:t>
-      </w:r>
-      <w:r>
-        <w:rPr>
-          <w:rFonts w:ascii="Times New Roman Regular" w:hAnsi="Times New Roman Regular" w:cs="Times New Roman Regular" w:hint="eastAsia"/>
-          <w:sz w:val="21"/>
-          <w:szCs w:val="21"/>
-          <w:lang w:eastAsia="zh-CN"/>
-          <w:b w:val="0"/>
-        </w:rPr>
-        <w:t xml:space="preserve"/>
-        <w:tab/>
-        <w:t xml:space="preserve">Feb 2024 - Jul 2025</w:t>
-      </w:r>
-    </w:p>
-    <w:p>
-      <w:pPr>
-        <w:widowControl/>
-        <w:autoSpaceDE/>
-        <w:autoSpaceDN/>
-        <w:spacing w:after="10" w:line="212" w:lineRule="auto"/>
-        <w:rPr>
-          <w:rFonts w:ascii="Times New Roman Regular" w:hAnsi="Times New Roman Regular" w:cs="Times New Roman Regular"/>
-          <w:sz w:val="21"/>
-          <w:szCs w:val="21"/>
-          <w:lang w:eastAsia="zh-CN"/>
-        </w:rPr>
-        <w:tabs>
-          <w:tab w:val="right" w:pos="10880"/>
-        </w:tabs>
-      </w:pPr>
-      <w:r>
-        <w:rPr>
-          <w:rFonts w:ascii="Times New Roman Regular" w:hAnsi="Times New Roman Regular" w:cs="Times New Roman Regular" w:hint="eastAsia"/>
-          <w:sz w:val="21"/>
-          <w:szCs w:val="21"/>
-          <w:lang w:eastAsia="zh-CN"/>
-          <w:b w:val="0"/>
-        </w:rPr>
-        <w:t xml:space="preserve">Co-first author | Advisor: Dr. Baha Ihnaini</w:t>
-      </w:r>
-    </w:p>
-    <w:p>
-      <w:pPr>
-        <w:widowControl/>
-        <w:numPr>
-          <w:ilvl w:val="0"/>
-          <w:numId w:val="1"/>
-        </w:numPr>
-        <w:autoSpaceDE/>
-        <w:autoSpaceDN/>
-        <w:spacing w:after="20" w:line="212" w:lineRule="auto"/>
-        <w:ind w:hanging="357"/>
-        <w:rPr>
-          <w:rFonts w:ascii="Times New Roman Regular" w:hAnsi="Times New Roman Regular" w:cs="Times New Roman Regular"/>
-          <w:sz w:val="21"/>
-          <w:szCs w:val="21"/>
-          <w:lang w:eastAsia="zh-CN"/>
-        </w:rPr>
-      </w:pPr>
-      <w:r>
-        <w:rPr>
-          <w:rFonts w:ascii="Times New Roman Regular" w:hAnsi="Times New Roman Regular" w:cs="Times New Roman Regular"/>
-          <w:sz w:val="21"/>
-          <w:szCs w:val="21"/>
-          <w:lang w:eastAsia="zh-CN"/>
-        </w:rPr>
-        <w:t>Built a speech-to-text pipeline for cognitive screening, including audio normalization, transcript correction, and a curated Chinese-language subset.</w:t>
-      </w:r>
-    </w:p>
-    <w:p>
-      <w:pPr>
-        <w:widowControl/>
-        <w:numPr>
-          <w:ilvl w:val="0"/>
-          <w:numId w:val="1"/>
-        </w:numPr>
-        <w:autoSpaceDE/>
-        <w:autoSpaceDN/>
-        <w:spacing w:after="20" w:line="212" w:lineRule="auto"/>
-        <w:ind w:hanging="357"/>
-        <w:rPr>
-          <w:rFonts w:ascii="Times New Roman Regular" w:hAnsi="Times New Roman Regular" w:cs="Times New Roman Regular"/>
-          <w:sz w:val="21"/>
-          <w:szCs w:val="21"/>
-          <w:lang w:eastAsia="zh-CN"/>
-        </w:rPr>
-      </w:pPr>
-      <w:r>
-        <w:rPr>
-          <w:rFonts w:ascii="Times New Roman Regular" w:hAnsi="Times New Roman Regular" w:cs="Times New Roman Regular"/>
-          <w:sz w:val="21"/>
-          <w:szCs w:val="21"/>
-          <w:lang w:eastAsia="zh-CN"/>
-        </w:rPr>
-        <w:t>Compared prompting with supervised fine-tuning and LoRA on Llama-3, Gemma, and Qwen, including unquantized, 8-bit, and 4-bit configurations.</w:t>
-      </w:r>
-    </w:p>
-    <w:p>
-      <w:pPr>
-        <w:widowControl/>
-        <w:numPr>
-          <w:ilvl w:val="0"/>
-          <w:numId w:val="1"/>
-        </w:numPr>
-        <w:autoSpaceDE/>
-        <w:autoSpaceDN/>
-        <w:spacing w:after="20" w:line="212" w:lineRule="auto"/>
-        <w:ind w:hanging="357"/>
-        <w:rPr>
-          <w:rFonts w:ascii="Times New Roman Regular" w:hAnsi="Times New Roman Regular" w:cs="Times New Roman Regular"/>
-          <w:sz w:val="21"/>
-          <w:szCs w:val="21"/>
-          <w:lang w:eastAsia="zh-CN"/>
-        </w:rPr>
-      </w:pPr>
-      <w:r>
-        <w:rPr>
-          <w:rFonts w:ascii="Times New Roman Regular" w:hAnsi="Times New Roman Regular" w:cs="Times New Roman Regular"/>
-          <w:sz w:val="21"/>
-          <w:szCs w:val="21"/>
-          <w:lang w:eastAsia="zh-CN"/>
-        </w:rPr>
-        <w:t>Implemented balanced 5-fold cross-validation to evaluate screening performance across prompting, adaptation, and quantization settings.</w:t>
-      </w:r>
-    </w:p>
-    <w:p>
-      <w:pPr>
-        <w:widowControl/>
-        <w:autoSpaceDE/>
-        <w:autoSpaceDN/>
-        <w:spacing w:after="20" w:line="212" w:lineRule="auto" w:before="60"/>
-        <w:rPr>
-          <w:rFonts w:ascii="Times New Roman Bold" w:hAnsi="Times New Roman Bold" w:cs="Times New Roman Bold"/>
-          <w:b/>
-          <w:bCs/>
-          <w:sz w:val="21"/>
-          <w:szCs w:val="21"/>
-          <w:lang w:eastAsia="zh-CN"/>
-        </w:rPr>
-        <w:tabs>
-          <w:tab w:val="right" w:pos="10880"/>
-        </w:tabs>
-        <w:keepNext/>
-      </w:pPr>
-      <w:r>
-        <w:rPr>
-          <w:rFonts w:ascii="Times New Roman Bold" w:hAnsi="Times New Roman Bold" w:cs="Times New Roman Bold"/>
-          <w:bCs/>
-          <w:sz w:val="21"/>
-          <w:szCs w:val="21"/>
-          <w:lang w:eastAsia="zh-CN"/>
-          <w:b w:val="1"/>
-        </w:rPr>
-        <w:t xml:space="preserve">RepoFusion-in-Decoder</w:t>
-      </w:r>
-      <w:r>
-        <w:rPr>
-          <w:rFonts w:ascii="Times New Roman Regular" w:hAnsi="Times New Roman Regular" w:cs="Times New Roman Regular" w:hint="eastAsia"/>
-          <w:sz w:val="21"/>
-          <w:szCs w:val="21"/>
-          <w:lang w:eastAsia="zh-CN"/>
-          <w:b w:val="0"/>
-        </w:rPr>
-        <w:t xml:space="preserve"/>
-        <w:tab/>
-        <w:t xml:space="preserve">Apr 2025 - Aug 2025</w:t>
-      </w:r>
-    </w:p>
-    <w:p>
-      <w:pPr>
-        <w:widowControl/>
-        <w:numPr>
-          <w:ilvl w:val="0"/>
-          <w:numId w:val="1"/>
-        </w:numPr>
-        <w:autoSpaceDE/>
-        <w:autoSpaceDN/>
-        <w:spacing w:after="20" w:line="212" w:lineRule="auto"/>
-        <w:ind w:hanging="357"/>
-        <w:rPr>
-          <w:rFonts w:ascii="Times New Roman Regular" w:hAnsi="Times New Roman Regular" w:cs="Times New Roman Regular"/>
-          <w:sz w:val="21"/>
-          <w:szCs w:val="21"/>
-          <w:lang w:eastAsia="zh-CN"/>
-        </w:rPr>
-      </w:pPr>
-      <w:r>
-        <w:rPr>
-          <w:rFonts w:ascii="Times New Roman Regular" w:hAnsi="Times New Roman Regular" w:cs="Times New Roman Regular"/>
-          <w:sz w:val="21"/>
-          <w:szCs w:val="21"/>
-          <w:lang w:eastAsia="zh-CN"/>
-        </w:rPr>
-        <w:t>Implemented lightweight encoder fusion and cross-attention to incorporate retrieved repository context into a frozen code language model for cross-file completion.</w:t>
-      </w:r>
-    </w:p>
-    <w:p>
-      <w:pPr>
-        <w:widowControl/>
-        <w:numPr>
-          <w:ilvl w:val="0"/>
-          <w:numId w:val="1"/>
-        </w:numPr>
-        <w:autoSpaceDE/>
-        <w:autoSpaceDN/>
-        <w:spacing w:after="20" w:line="212" w:lineRule="auto"/>
-        <w:ind w:hanging="357"/>
-        <w:rPr>
-          <w:rFonts w:ascii="Times New Roman Regular" w:hAnsi="Times New Roman Regular" w:cs="Times New Roman Regular"/>
-          <w:sz w:val="21"/>
-          <w:szCs w:val="21"/>
-          <w:lang w:eastAsia="zh-CN"/>
-        </w:rPr>
-      </w:pPr>
-      <w:r>
-        <w:rPr>
-          <w:rFonts w:ascii="Times New Roman Regular" w:hAnsi="Times New Roman Regular" w:cs="Times New Roman Regular"/>
-          <w:sz w:val="21"/>
-          <w:szCs w:val="21"/>
-          <w:lang w:eastAsia="zh-CN"/>
-        </w:rPr>
-        <w:t>Built BM25 retrieval and sliding-window chunking; cached encoder states to reuse repository context across completion requests.</w:t>
-      </w:r>
-    </w:p>
-    <w:p>
-      <w:pPr>
-        <w:widowControl/>
-        <w:numPr>
-          <w:ilvl w:val="0"/>
-          <w:numId w:val="1"/>
-        </w:numPr>
-        <w:autoSpaceDE/>
-        <w:autoSpaceDN/>
-        <w:spacing w:after="20" w:line="212" w:lineRule="auto"/>
-        <w:ind w:hanging="357"/>
-        <w:rPr>
-          <w:rFonts w:ascii="Times New Roman Regular" w:hAnsi="Times New Roman Regular" w:cs="Times New Roman Regular"/>
-          <w:sz w:val="21"/>
-          <w:szCs w:val="21"/>
-          <w:lang w:eastAsia="zh-CN"/>
-        </w:rPr>
-      </w:pPr>
-      <w:r>
-        <w:rPr>
-          <w:rFonts w:ascii="Times New Roman Regular" w:hAnsi="Times New Roman Regular" w:cs="Times New Roman Regular"/>
-          <w:sz w:val="21"/>
-          <w:szCs w:val="21"/>
-          <w:lang w:eastAsia="zh-CN"/>
-        </w:rPr>
-        <w:t>Benchmarked completion quality and prefill latency on Long Code Arena and RepoEval-Updated; ablated cross-attention depth to assess the quality-efficiency trade-off.</w:t>
-      </w:r>
-    </w:p>
-    <w:p>
-      <w:pPr>
-        <w:rPr>
-          <w:rFonts w:ascii="Times New Roman Bold" w:hAnsi="Times New Roman Bold" w:cs="Times New Roman Bold"/>
-          <w:b/>
-          <w:bCs/>
-          <w:sz w:val="21"/>
-          <w:szCs w:val="21"/>
-          <w:lang w:eastAsia="zh-CN"/>
-        </w:rPr>
-        <w:tabs>
-          <w:tab w:val="right" w:pos="10880"/>
-        </w:tabs>
-        <w:spacing w:before="60" w:after="20"/>
-        <w:keepNext/>
-      </w:pPr>
-      <w:r>
-        <w:rPr>
-          <w:rFonts w:ascii="Times New Roman Bold" w:hAnsi="Times New Roman Bold" w:cs="Times New Roman Bold"/>
-          <w:bCs/>
-          <w:sz w:val="21"/>
-          <w:szCs w:val="21"/>
-          <w:lang w:eastAsia="zh-CN"/>
-          <w:b w:val="1"/>
-        </w:rPr>
-        <w:t xml:space="preserve">CT Image Reconstruction</w:t>
-      </w:r>
-      <w:r>
-        <w:rPr>
-          <w:rFonts w:ascii="Times New Roman Regular" w:hAnsi="Times New Roman Regular" w:cs="Times New Roman Regular" w:hint="eastAsia"/>
-          <w:sz w:val="21"/>
-          <w:szCs w:val="21"/>
-          <w:lang w:eastAsia="zh-CN"/>
-          <w:b w:val="0"/>
-        </w:rPr>
-        <w:t xml:space="preserve"/>
-        <w:tab/>
-        <w:t xml:space="preserve">Feb 2025 - Jun 2025</w:t>
-      </w:r>
-    </w:p>
-    <w:p>
-      <w:pPr>
-        <w:widowControl/>
-        <w:numPr>
-          <w:ilvl w:val="0"/>
-          <w:numId w:val="1"/>
-        </w:numPr>
-        <w:autoSpaceDE/>
-        <w:autoSpaceDN/>
-        <w:spacing w:after="20" w:line="212" w:lineRule="auto"/>
-        <w:ind w:hanging="357"/>
-        <w:rPr>
-          <w:rFonts w:ascii="Times New Roman Regular" w:hAnsi="Times New Roman Regular" w:cs="Times New Roman Regular"/>
-          <w:sz w:val="21"/>
-          <w:szCs w:val="21"/>
-          <w:lang w:eastAsia="zh-CN"/>
-        </w:rPr>
-      </w:pPr>
-      <w:r>
-        <w:rPr>
-          <w:rFonts w:ascii="Times New Roman Regular" w:hAnsi="Times New Roman Regular" w:cs="Times New Roman Regular"/>
-          <w:sz w:val="21"/>
-          <w:szCs w:val="21"/>
-          <w:lang w:eastAsia="zh-CN"/>
-        </w:rPr>
-        <w:t>Implemented a U-Net with kernel basis attention and multi-axis fusion for low-dose and sparse-view CT; evaluated MSE, SSIM, and a CNN observer task.</w:t>
-      </w:r>
-    </w:p>
-    <w:p>
-      <w:pPr>
-        <w:rPr>
-          <w:rFonts w:ascii="Times New Roman Regular" w:eastAsia="宋体" w:hAnsi="Times New Roman Regular" w:cs="Times New Roman Regular"/>
-          <w:b/>
-          <w:bCs/>
-          <w:sz w:val="21"/>
-          <w:szCs w:val="21"/>
-          <w:lang w:eastAsia="zh-CN"/>
-        </w:rPr>
-        <w:tabs>
-          <w:tab w:val="right" w:pos="10880"/>
-        </w:tabs>
-        <w:spacing w:before="60" w:after="20"/>
-        <w:keepNext/>
-      </w:pPr>
-      <w:r>
-        <w:rPr>
-          <w:rFonts w:ascii="Times New Roman Regular" w:hAnsi="Times New Roman Regular" w:cs="Times New Roman Regular" w:hint="eastAsia"/>
-          <w:bCs/>
-          <w:sz w:val="21"/>
-          <w:szCs w:val="21"/>
-          <w:b w:val="1"/>
-        </w:rPr>
-        <w:t xml:space="preserve">Reinforcement Learning for UAV Planning</w:t>
-      </w:r>
-      <w:r>
-        <w:rPr>
-          <w:rFonts w:ascii="Times New Roman Regular" w:hAnsi="Times New Roman Regular" w:cs="Times New Roman Regular" w:hint="eastAsia"/>
-          <w:sz w:val="21"/>
-          <w:szCs w:val="21"/>
-          <w:lang w:eastAsia="zh-CN"/>
-          <w:b w:val="0"/>
-        </w:rPr>
-        <w:t xml:space="preserve"/>
-        <w:tab/>
-        <w:t xml:space="preserve">Sep 2024 - Oct 2025</w:t>
-      </w:r>
-    </w:p>
-    <w:p>
-      <w:pPr>
-        <w:widowControl/>
-        <w:numPr>
-          <w:ilvl w:val="0"/>
-          <w:numId w:val="1"/>
-        </w:numPr>
-        <w:autoSpaceDE/>
-        <w:autoSpaceDN/>
-        <w:spacing w:after="20" w:line="212" w:lineRule="auto"/>
-        <w:ind w:hanging="357"/>
-        <w:rPr>
-          <w:rFonts w:ascii="Times New Roman Regular" w:hAnsi="Times New Roman Regular" w:cs="Times New Roman Regular"/>
-          <w:sz w:val="21"/>
-          <w:szCs w:val="21"/>
-          <w:lang w:eastAsia="zh-CN"/>
-        </w:rPr>
-      </w:pPr>
-      <w:r>
-        <w:rPr>
-          <w:rFonts w:ascii="Times New Roman Regular" w:hAnsi="Times New Roman Regular" w:cs="Times New Roman Regular" w:hint="eastAsia"/>
-          <w:sz w:val="21"/>
-          <w:szCs w:val="21"/>
-          <w:lang w:eastAsia="zh-CN"/>
-        </w:rPr>
-        <w:t>Implemented enhanced Noisy DQN for communication-constrained UAV planning; evaluated against DQN, NoisyNet, and Double DQN in a 15 x 15 grid.</w:t>
-      </w:r>
-    </w:p>
-    <w:p>
-      <w:pPr>
-        <w:widowControl/>
-        <w:pBdr>
-          <w:bottom w:val="single" w:sz="6" w:space="1" w:color="auto"/>
-        </w:pBdr>
-        <w:autoSpaceDE/>
-        <w:autoSpaceDN/>
-        <w:spacing w:after="50" w:before="60"/>
-        <w:outlineLvl w:val="0"/>
-        <w:rPr>
-          <w:rFonts w:ascii="Times New Roman Regular" w:hAnsi="Times New Roman Regular" w:cs="Times New Roman Regular"/>
-          <w:sz w:val="21"/>
-          <w:szCs w:val="21"/>
-        </w:rPr>
-        <w:keepNext/>
-      </w:pPr>
-      <w:r>
-        <w:rPr>
-          <w:rFonts w:ascii="Times New Roman" w:hAnsi="Times New Roman"/>
-          <w:smallCaps/>
-          <w:sz w:val="21"/>
-          <w:szCs w:val="21"/>
-          <w:lang w:eastAsia="zh-CN"/>
-        </w:rPr>
-        <w:t xml:space="preserve">INTERESTS &amp; SKILLS</w:t>
-      </w:r>
-    </w:p>
-    <w:p>
-      <w:pPr>
-        <w:widowControl/>
-        <w:numPr>
-          <w:ilvl w:val="0"/>
-          <w:numId w:val="1"/>
-        </w:numPr>
-        <w:autoSpaceDE/>
-        <w:autoSpaceDN/>
-        <w:spacing w:after="20" w:line="212" w:lineRule="auto"/>
-        <w:ind w:hanging="357"/>
-        <w:rPr>
-          <w:rFonts w:ascii="Times New Roman Regular" w:hAnsi="Times New Roman Regular" w:cs="Times New Roman Regular"/>
-          <w:sz w:val="21"/>
-          <w:szCs w:val="21"/>
-          <w:lang w:eastAsia="zh-CN"/>
-        </w:rPr>
-      </w:pPr>
-      <w:r>
-        <w:rPr>
-          <w:rFonts w:ascii="Times New Roman Regular" w:hAnsi="Times New Roman Regular" w:cs="Times New Roman Regular" w:hint="eastAsia"/>
-          <w:sz w:val="21"/>
-          <w:szCs w:val="21"/>
-          <w:lang w:eastAsia="zh-CN"/>
-        </w:rPr>
-        <w:t>Methods: LLM fine-tuning, LoRA, quantization, retrieval-augmented modeling, token attribution.</w:t>
-      </w:r>
-    </w:p>
-    <w:p>
-      <w:pPr>
-        <w:widowControl/>
-        <w:numPr>
-          <w:ilvl w:val="0"/>
-          <w:numId w:val="1"/>
-        </w:numPr>
-        <w:autoSpaceDE/>
-        <w:autoSpaceDN/>
-        <w:spacing w:after="20" w:line="212" w:lineRule="auto"/>
-        <w:ind w:hanging="357"/>
-        <w:rPr>
-          <w:rFonts w:ascii="Times New Roman Regular" w:hAnsi="Times New Roman Regular" w:cs="Times New Roman Regular"/>
-          <w:sz w:val="21"/>
-          <w:szCs w:val="21"/>
-          <w:lang w:eastAsia="zh-CN"/>
-        </w:rPr>
-      </w:pPr>
-      <w:r>
-        <w:rPr>
-          <w:rFonts w:ascii="Times New Roman Regular" w:hAnsi="Times New Roman Regular" w:cs="Times New Roman Regular"/>
-          <w:sz w:val="21"/>
-          <w:szCs w:val="21"/>
-          <w:lang w:eastAsia="zh-CN"/>
-        </w:rPr>
-        <w:t xml:space="preserve">Research Interests: Multimodal Large Language Models; Computer Vision; Reinforcement Learning; Reliable Large Language Models.</w:t>
+        <w:t xml:space="preserve">Multimodal Large Language Models; Computer Vision; Reinforcement Learning; Reliable Large Language Models.</w:t>
       </w:r>
     </w:p>
     <w:sectPr>
       <w:pgSz w:w="11900" w:h="16840"/>
-      <w:pgMar w:top="431" w:right="510" w:bottom="280" w:left="510" w:header="720" w:footer="720" w:gutter="0"/>
+      <w:pgMar w:top="576" w:right="576" w:bottom="576" w:left="576" w:header="720" w:footer="720" w:gutter="0"/>
       <w:cols w:space="720"/>
     </w:sectPr>
   </w:body>

</xml_diff>